<commit_message>
vault backup: 2026-06-03 04:22:47
</commit_message>
<xml_diff>
--- a/Курс 3/Проектирование БД/Курисовая/Ред_РПЗ_Кринкин.docx
+++ b/Курс 3/Проектирование БД/Курисовая/Ред_РПЗ_Кринкин.docx
@@ -21185,6 +21185,11 @@
       <w:bookmarkEnd w:id="13"/>
     </w:p>
     <w:p>
+      <w:pPr>
+        <w:rPr>
+          <w:lang w:val="en-US"/>
+        </w:rPr>
+      </w:pPr>
       <w:r>
         <w:t>Запросы:</w:t>
       </w:r>
@@ -21196,15 +21201,9 @@
           <w:ilvl w:val="0"/>
           <w:numId w:val="10"/>
         </w:numPr>
-        <w:rPr>
-          <w:color w:val="000000" w:themeColor="text1"/>
-        </w:rPr>
-      </w:pPr>
-      <w:r>
-        <w:rPr>
-          <w:color w:val="000000" w:themeColor="text1"/>
-        </w:rPr>
-        <w:t>Получение списка всех активных сделок</w:t>
+      </w:pPr>
+      <w:r>
+        <w:t>Получение всей информации без ключей</w:t>
       </w:r>
     </w:p>
     <w:p>
@@ -21212,7 +21211,7 @@
         <w:pStyle w:val="a7"/>
         <w:ind w:firstLine="0"/>
         <w:rPr>
-          <w:color w:val="000000" w:themeColor="text1"/>
+          <w:lang w:val="en-US"/>
         </w:rPr>
       </w:pPr>
     </w:p>
@@ -21236,17 +21235,15 @@
               <w:ind w:firstLine="0"/>
               <w:rPr>
                 <w:rFonts w:ascii="Cascadia Mono" w:hAnsi="Cascadia Mono" w:cs="Cascadia Mono"/>
-                <w:color w:val="000000" w:themeColor="text1"/>
-                <w:sz w:val="22"/>
-                <w:szCs w:val="22"/>
+                <w:sz w:val="20"/>
+                <w:szCs w:val="20"/>
               </w:rPr>
             </w:pPr>
             <w:r>
               <w:rPr>
                 <w:rFonts w:ascii="Cascadia Mono" w:hAnsi="Cascadia Mono" w:cs="Cascadia Mono"/>
-                <w:color w:val="000000" w:themeColor="text1"/>
-                <w:sz w:val="22"/>
-                <w:szCs w:val="22"/>
+                <w:sz w:val="20"/>
+                <w:szCs w:val="20"/>
               </w:rPr>
               <w:t xml:space="preserve">SELECT </w:t>
             </w:r>
@@ -21256,19 +21253,17 @@
               <w:ind w:firstLine="0"/>
               <w:rPr>
                 <w:rFonts w:ascii="Cascadia Mono" w:hAnsi="Cascadia Mono" w:cs="Cascadia Mono"/>
-                <w:color w:val="000000" w:themeColor="text1"/>
-                <w:sz w:val="22"/>
-                <w:szCs w:val="22"/>
+                <w:sz w:val="20"/>
+                <w:szCs w:val="20"/>
               </w:rPr>
             </w:pPr>
             <w:r>
               <w:rPr>
                 <w:rFonts w:ascii="Cascadia Mono" w:hAnsi="Cascadia Mono" w:cs="Cascadia Mono"/>
-                <w:color w:val="000000" w:themeColor="text1"/>
-                <w:sz w:val="22"/>
-                <w:szCs w:val="22"/>
-              </w:rPr>
-              <w:t xml:space="preserve">    Сделка.[Код сделки], </w:t>
+                <w:sz w:val="20"/>
+                <w:szCs w:val="20"/>
+              </w:rPr>
+              <w:t xml:space="preserve">     Сделка.[Дата сделки], </w:t>
             </w:r>
           </w:p>
           <w:p>
@@ -21276,19 +21271,17 @@
               <w:ind w:firstLine="0"/>
               <w:rPr>
                 <w:rFonts w:ascii="Cascadia Mono" w:hAnsi="Cascadia Mono" w:cs="Cascadia Mono"/>
-                <w:color w:val="000000" w:themeColor="text1"/>
-                <w:sz w:val="22"/>
-                <w:szCs w:val="22"/>
+                <w:sz w:val="20"/>
+                <w:szCs w:val="20"/>
               </w:rPr>
             </w:pPr>
             <w:r>
               <w:rPr>
                 <w:rFonts w:ascii="Cascadia Mono" w:hAnsi="Cascadia Mono" w:cs="Cascadia Mono"/>
-                <w:color w:val="000000" w:themeColor="text1"/>
-                <w:sz w:val="22"/>
-                <w:szCs w:val="22"/>
-              </w:rPr>
-              <w:t xml:space="preserve">    Сделка.[Стоимость], </w:t>
+                <w:sz w:val="20"/>
+                <w:szCs w:val="20"/>
+              </w:rPr>
+              <w:t xml:space="preserve">     Сделка.[Дата окончания договора],</w:t>
             </w:r>
           </w:p>
           <w:p>
@@ -21296,19 +21289,17 @@
               <w:ind w:firstLine="0"/>
               <w:rPr>
                 <w:rFonts w:ascii="Cascadia Mono" w:hAnsi="Cascadia Mono" w:cs="Cascadia Mono"/>
-                <w:color w:val="000000" w:themeColor="text1"/>
-                <w:sz w:val="22"/>
-                <w:szCs w:val="22"/>
+                <w:sz w:val="20"/>
+                <w:szCs w:val="20"/>
               </w:rPr>
             </w:pPr>
             <w:r>
               <w:rPr>
                 <w:rFonts w:ascii="Cascadia Mono" w:hAnsi="Cascadia Mono" w:cs="Cascadia Mono"/>
-                <w:color w:val="000000" w:themeColor="text1"/>
-                <w:sz w:val="22"/>
-                <w:szCs w:val="22"/>
-              </w:rPr>
-              <w:t xml:space="preserve">    Владелец.[Фамилия],</w:t>
+                <w:sz w:val="20"/>
+                <w:szCs w:val="20"/>
+              </w:rPr>
+              <w:t xml:space="preserve">     Сделка.[Стоимость],</w:t>
             </w:r>
           </w:p>
           <w:p>
@@ -21316,19 +21307,17 @@
               <w:ind w:firstLine="0"/>
               <w:rPr>
                 <w:rFonts w:ascii="Cascadia Mono" w:hAnsi="Cascadia Mono" w:cs="Cascadia Mono"/>
-                <w:color w:val="000000" w:themeColor="text1"/>
-                <w:sz w:val="22"/>
-                <w:szCs w:val="22"/>
+                <w:sz w:val="20"/>
+                <w:szCs w:val="20"/>
               </w:rPr>
             </w:pPr>
             <w:r>
               <w:rPr>
                 <w:rFonts w:ascii="Cascadia Mono" w:hAnsi="Cascadia Mono" w:cs="Cascadia Mono"/>
-                <w:color w:val="000000" w:themeColor="text1"/>
-                <w:sz w:val="22"/>
-                <w:szCs w:val="22"/>
-              </w:rPr>
-              <w:t xml:space="preserve">    Риэлтор.[Фамилия],</w:t>
+                <w:sz w:val="20"/>
+                <w:szCs w:val="20"/>
+              </w:rPr>
+              <w:t xml:space="preserve">     [Статус сделки].[Статус сделки],</w:t>
             </w:r>
           </w:p>
           <w:p>
@@ -21336,19 +21325,17 @@
               <w:ind w:firstLine="0"/>
               <w:rPr>
                 <w:rFonts w:ascii="Cascadia Mono" w:hAnsi="Cascadia Mono" w:cs="Cascadia Mono"/>
-                <w:color w:val="000000" w:themeColor="text1"/>
-                <w:sz w:val="22"/>
-                <w:szCs w:val="22"/>
+                <w:sz w:val="20"/>
+                <w:szCs w:val="20"/>
               </w:rPr>
             </w:pPr>
             <w:r>
               <w:rPr>
                 <w:rFonts w:ascii="Cascadia Mono" w:hAnsi="Cascadia Mono" w:cs="Cascadia Mono"/>
-                <w:color w:val="000000" w:themeColor="text1"/>
-                <w:sz w:val="22"/>
-                <w:szCs w:val="22"/>
-              </w:rPr>
-              <w:t xml:space="preserve">    Предложение.*</w:t>
+                <w:sz w:val="20"/>
+                <w:szCs w:val="20"/>
+              </w:rPr>
+              <w:t xml:space="preserve">     Владелец.[Фамилия] &amp; " " &amp; Владелец.[Имя] &amp; " " &amp; Владелец.[Отчество] AS [ФИО владельца],</w:t>
             </w:r>
           </w:p>
           <w:p>
@@ -21356,19 +21343,17 @@
               <w:ind w:firstLine="0"/>
               <w:rPr>
                 <w:rFonts w:ascii="Cascadia Mono" w:hAnsi="Cascadia Mono" w:cs="Cascadia Mono"/>
-                <w:color w:val="000000" w:themeColor="text1"/>
-                <w:sz w:val="22"/>
-                <w:szCs w:val="22"/>
+                <w:sz w:val="20"/>
+                <w:szCs w:val="20"/>
               </w:rPr>
             </w:pPr>
             <w:r>
               <w:rPr>
                 <w:rFonts w:ascii="Cascadia Mono" w:hAnsi="Cascadia Mono" w:cs="Cascadia Mono"/>
-                <w:color w:val="000000" w:themeColor="text1"/>
-                <w:sz w:val="22"/>
-                <w:szCs w:val="22"/>
-              </w:rPr>
-              <w:t>FROM (((Сделка</w:t>
+                <w:sz w:val="20"/>
+                <w:szCs w:val="20"/>
+              </w:rPr>
+              <w:t xml:space="preserve">     Владелец.[Серия паспорта],</w:t>
             </w:r>
           </w:p>
           <w:p>
@@ -21376,19 +21361,17 @@
               <w:ind w:firstLine="0"/>
               <w:rPr>
                 <w:rFonts w:ascii="Cascadia Mono" w:hAnsi="Cascadia Mono" w:cs="Cascadia Mono"/>
-                <w:color w:val="000000" w:themeColor="text1"/>
-                <w:sz w:val="22"/>
-                <w:szCs w:val="22"/>
+                <w:sz w:val="20"/>
+                <w:szCs w:val="20"/>
               </w:rPr>
             </w:pPr>
             <w:r>
               <w:rPr>
                 <w:rFonts w:ascii="Cascadia Mono" w:hAnsi="Cascadia Mono" w:cs="Cascadia Mono"/>
-                <w:color w:val="000000" w:themeColor="text1"/>
-                <w:sz w:val="22"/>
-                <w:szCs w:val="22"/>
-              </w:rPr>
-              <w:t>INNER JOIN Риэлтор ON Сделка.[Код риэлтора] = Риэлтор.[Код риэлтора])</w:t>
+                <w:sz w:val="20"/>
+                <w:szCs w:val="20"/>
+              </w:rPr>
+              <w:t xml:space="preserve">     Владелец.[Номер паспорта],</w:t>
             </w:r>
           </w:p>
           <w:p>
@@ -21396,19 +21379,17 @@
               <w:ind w:firstLine="0"/>
               <w:rPr>
                 <w:rFonts w:ascii="Cascadia Mono" w:hAnsi="Cascadia Mono" w:cs="Cascadia Mono"/>
-                <w:color w:val="000000" w:themeColor="text1"/>
-                <w:sz w:val="22"/>
-                <w:szCs w:val="22"/>
+                <w:sz w:val="20"/>
+                <w:szCs w:val="20"/>
               </w:rPr>
             </w:pPr>
             <w:r>
               <w:rPr>
                 <w:rFonts w:ascii="Cascadia Mono" w:hAnsi="Cascadia Mono" w:cs="Cascadia Mono"/>
-                <w:color w:val="000000" w:themeColor="text1"/>
-                <w:sz w:val="22"/>
-                <w:szCs w:val="22"/>
-              </w:rPr>
-              <w:t>INNER JOIN Владелец ON Сделка.[Код владельца] = Владелец.[Код владельца])</w:t>
+                <w:sz w:val="20"/>
+                <w:szCs w:val="20"/>
+              </w:rPr>
+              <w:t xml:space="preserve">     Владелец.[ИНН],</w:t>
             </w:r>
           </w:p>
           <w:p>
@@ -21416,37 +21397,1309 @@
               <w:ind w:firstLine="0"/>
               <w:rPr>
                 <w:rFonts w:ascii="Cascadia Mono" w:hAnsi="Cascadia Mono" w:cs="Cascadia Mono"/>
-                <w:color w:val="000000" w:themeColor="text1"/>
-                <w:sz w:val="22"/>
-                <w:szCs w:val="22"/>
+                <w:sz w:val="20"/>
+                <w:szCs w:val="20"/>
               </w:rPr>
             </w:pPr>
             <w:r>
               <w:rPr>
                 <w:rFonts w:ascii="Cascadia Mono" w:hAnsi="Cascadia Mono" w:cs="Cascadia Mono"/>
-                <w:color w:val="000000" w:themeColor="text1"/>
-                <w:sz w:val="22"/>
-                <w:szCs w:val="22"/>
-              </w:rPr>
-              <w:t>INNER JOIN Предложение ON Сделка.[Номер предложения] = Предложение.[Номер предложения])</w:t>
-            </w:r>
-          </w:p>
-          <w:p>
-            <w:pPr>
-              <w:pStyle w:val="a7"/>
-              <w:ind w:left="0" w:firstLine="0"/>
-              <w:rPr>
-                <w:color w:val="000000" w:themeColor="text1"/>
-              </w:rPr>
-            </w:pPr>
-            <w:r>
+                <w:sz w:val="20"/>
+                <w:szCs w:val="20"/>
+              </w:rPr>
+              <w:t xml:space="preserve">     Владелец.[Номер телефона], </w:t>
+            </w:r>
+          </w:p>
+          <w:p>
+            <w:pPr>
+              <w:ind w:firstLine="0"/>
               <w:rPr>
                 <w:rFonts w:ascii="Cascadia Mono" w:hAnsi="Cascadia Mono" w:cs="Cascadia Mono"/>
-                <w:color w:val="000000" w:themeColor="text1"/>
-                <w:sz w:val="22"/>
-                <w:szCs w:val="22"/>
-              </w:rPr>
-              <w:t>WHERE (((Сделка.[Код статуса сделки])=1));</w:t>
+                <w:sz w:val="20"/>
+                <w:szCs w:val="20"/>
+              </w:rPr>
+            </w:pPr>
+            <w:r>
+              <w:rPr>
+                <w:rFonts w:ascii="Cascadia Mono" w:hAnsi="Cascadia Mono" w:cs="Cascadia Mono"/>
+                <w:sz w:val="20"/>
+                <w:szCs w:val="20"/>
+              </w:rPr>
+              <w:t xml:space="preserve">     Покупатель.[Фамилия] &amp; " " &amp; Покупатель.[Имя] &amp; " " &amp; Покупатель.[Отчество] AS [ФИО покупателя], </w:t>
+            </w:r>
+          </w:p>
+          <w:p>
+            <w:pPr>
+              <w:ind w:firstLine="0"/>
+              <w:rPr>
+                <w:rFonts w:ascii="Cascadia Mono" w:hAnsi="Cascadia Mono" w:cs="Cascadia Mono"/>
+                <w:sz w:val="20"/>
+                <w:szCs w:val="20"/>
+              </w:rPr>
+            </w:pPr>
+            <w:r>
+              <w:rPr>
+                <w:rFonts w:ascii="Cascadia Mono" w:hAnsi="Cascadia Mono" w:cs="Cascadia Mono"/>
+                <w:sz w:val="20"/>
+                <w:szCs w:val="20"/>
+              </w:rPr>
+              <w:t xml:space="preserve">     Покупатель.[Пол], </w:t>
+            </w:r>
+          </w:p>
+          <w:p>
+            <w:pPr>
+              <w:ind w:firstLine="0"/>
+              <w:rPr>
+                <w:rFonts w:ascii="Cascadia Mono" w:hAnsi="Cascadia Mono" w:cs="Cascadia Mono"/>
+                <w:sz w:val="20"/>
+                <w:szCs w:val="20"/>
+              </w:rPr>
+            </w:pPr>
+            <w:r>
+              <w:rPr>
+                <w:rFonts w:ascii="Cascadia Mono" w:hAnsi="Cascadia Mono" w:cs="Cascadia Mono"/>
+                <w:sz w:val="20"/>
+                <w:szCs w:val="20"/>
+              </w:rPr>
+              <w:t xml:space="preserve">     Покупатель.[Дата рождения], </w:t>
+            </w:r>
+          </w:p>
+          <w:p>
+            <w:pPr>
+              <w:ind w:firstLine="0"/>
+              <w:rPr>
+                <w:rFonts w:ascii="Cascadia Mono" w:hAnsi="Cascadia Mono" w:cs="Cascadia Mono"/>
+                <w:sz w:val="20"/>
+                <w:szCs w:val="20"/>
+              </w:rPr>
+            </w:pPr>
+            <w:r>
+              <w:rPr>
+                <w:rFonts w:ascii="Cascadia Mono" w:hAnsi="Cascadia Mono" w:cs="Cascadia Mono"/>
+                <w:sz w:val="20"/>
+                <w:szCs w:val="20"/>
+              </w:rPr>
+              <w:t xml:space="preserve">     Покупатель.[Страна рождения], </w:t>
+            </w:r>
+          </w:p>
+          <w:p>
+            <w:pPr>
+              <w:ind w:firstLine="0"/>
+              <w:rPr>
+                <w:rFonts w:ascii="Cascadia Mono" w:hAnsi="Cascadia Mono" w:cs="Cascadia Mono"/>
+                <w:sz w:val="20"/>
+                <w:szCs w:val="20"/>
+              </w:rPr>
+            </w:pPr>
+            <w:r>
+              <w:rPr>
+                <w:rFonts w:ascii="Cascadia Mono" w:hAnsi="Cascadia Mono" w:cs="Cascadia Mono"/>
+                <w:sz w:val="20"/>
+                <w:szCs w:val="20"/>
+              </w:rPr>
+              <w:t xml:space="preserve">     Покупатель.[Город рождения],</w:t>
+            </w:r>
+          </w:p>
+          <w:p>
+            <w:pPr>
+              <w:ind w:firstLine="0"/>
+              <w:rPr>
+                <w:rFonts w:ascii="Cascadia Mono" w:hAnsi="Cascadia Mono" w:cs="Cascadia Mono"/>
+                <w:sz w:val="20"/>
+                <w:szCs w:val="20"/>
+              </w:rPr>
+            </w:pPr>
+            <w:r>
+              <w:rPr>
+                <w:rFonts w:ascii="Cascadia Mono" w:hAnsi="Cascadia Mono" w:cs="Cascadia Mono"/>
+                <w:sz w:val="20"/>
+                <w:szCs w:val="20"/>
+              </w:rPr>
+              <w:t xml:space="preserve">     Покупатель.[Серия паспорта],</w:t>
+            </w:r>
+          </w:p>
+          <w:p>
+            <w:pPr>
+              <w:ind w:firstLine="0"/>
+              <w:rPr>
+                <w:rFonts w:ascii="Cascadia Mono" w:hAnsi="Cascadia Mono" w:cs="Cascadia Mono"/>
+                <w:sz w:val="20"/>
+                <w:szCs w:val="20"/>
+              </w:rPr>
+            </w:pPr>
+            <w:r>
+              <w:rPr>
+                <w:rFonts w:ascii="Cascadia Mono" w:hAnsi="Cascadia Mono" w:cs="Cascadia Mono"/>
+                <w:sz w:val="20"/>
+                <w:szCs w:val="20"/>
+              </w:rPr>
+              <w:t xml:space="preserve">     Покупатель.[Номер паспорта],</w:t>
+            </w:r>
+          </w:p>
+          <w:p>
+            <w:pPr>
+              <w:ind w:firstLine="0"/>
+              <w:rPr>
+                <w:rFonts w:ascii="Cascadia Mono" w:hAnsi="Cascadia Mono" w:cs="Cascadia Mono"/>
+                <w:sz w:val="20"/>
+                <w:szCs w:val="20"/>
+              </w:rPr>
+            </w:pPr>
+            <w:r>
+              <w:rPr>
+                <w:rFonts w:ascii="Cascadia Mono" w:hAnsi="Cascadia Mono" w:cs="Cascadia Mono"/>
+                <w:sz w:val="20"/>
+                <w:szCs w:val="20"/>
+              </w:rPr>
+              <w:t xml:space="preserve">     Покупатель.[ИНН],</w:t>
+            </w:r>
+          </w:p>
+          <w:p>
+            <w:pPr>
+              <w:ind w:firstLine="0"/>
+              <w:rPr>
+                <w:rFonts w:ascii="Cascadia Mono" w:hAnsi="Cascadia Mono" w:cs="Cascadia Mono"/>
+                <w:sz w:val="20"/>
+                <w:szCs w:val="20"/>
+              </w:rPr>
+            </w:pPr>
+            <w:r>
+              <w:rPr>
+                <w:rFonts w:ascii="Cascadia Mono" w:hAnsi="Cascadia Mono" w:cs="Cascadia Mono"/>
+                <w:sz w:val="20"/>
+                <w:szCs w:val="20"/>
+              </w:rPr>
+              <w:t xml:space="preserve">     Покупатель.[Номер телефона], </w:t>
+            </w:r>
+          </w:p>
+          <w:p>
+            <w:pPr>
+              <w:ind w:firstLine="0"/>
+              <w:rPr>
+                <w:rFonts w:ascii="Cascadia Mono" w:hAnsi="Cascadia Mono" w:cs="Cascadia Mono"/>
+                <w:sz w:val="20"/>
+                <w:szCs w:val="20"/>
+              </w:rPr>
+            </w:pPr>
+            <w:r>
+              <w:rPr>
+                <w:rFonts w:ascii="Cascadia Mono" w:hAnsi="Cascadia Mono" w:cs="Cascadia Mono"/>
+                <w:sz w:val="20"/>
+                <w:szCs w:val="20"/>
+              </w:rPr>
+              <w:t xml:space="preserve">     Риэлтор.[Фамилия] &amp; " " &amp; Риэлтор.[Имя] &amp; " " &amp; Риэлтор.[Отчество] AS [ФИО риэлтора],</w:t>
+            </w:r>
+          </w:p>
+          <w:p>
+            <w:pPr>
+              <w:ind w:firstLine="0"/>
+              <w:rPr>
+                <w:rFonts w:ascii="Cascadia Mono" w:hAnsi="Cascadia Mono" w:cs="Cascadia Mono"/>
+                <w:sz w:val="20"/>
+                <w:szCs w:val="20"/>
+              </w:rPr>
+            </w:pPr>
+            <w:r>
+              <w:rPr>
+                <w:rFonts w:ascii="Cascadia Mono" w:hAnsi="Cascadia Mono" w:cs="Cascadia Mono"/>
+                <w:sz w:val="20"/>
+                <w:szCs w:val="20"/>
+              </w:rPr>
+              <w:t xml:space="preserve">     Лицензия.[Номер сертификата],</w:t>
+            </w:r>
+          </w:p>
+          <w:p>
+            <w:pPr>
+              <w:ind w:firstLine="0"/>
+              <w:rPr>
+                <w:rFonts w:ascii="Cascadia Mono" w:hAnsi="Cascadia Mono" w:cs="Cascadia Mono"/>
+                <w:sz w:val="20"/>
+                <w:szCs w:val="20"/>
+              </w:rPr>
+            </w:pPr>
+            <w:r>
+              <w:rPr>
+                <w:rFonts w:ascii="Cascadia Mono" w:hAnsi="Cascadia Mono" w:cs="Cascadia Mono"/>
+                <w:sz w:val="20"/>
+                <w:szCs w:val="20"/>
+              </w:rPr>
+              <w:t xml:space="preserve">     Лицензия.[Дата выдачи],</w:t>
+            </w:r>
+          </w:p>
+          <w:p>
+            <w:pPr>
+              <w:ind w:firstLine="0"/>
+              <w:rPr>
+                <w:rFonts w:ascii="Cascadia Mono" w:hAnsi="Cascadia Mono" w:cs="Cascadia Mono"/>
+                <w:sz w:val="20"/>
+                <w:szCs w:val="20"/>
+              </w:rPr>
+            </w:pPr>
+            <w:r>
+              <w:rPr>
+                <w:rFonts w:ascii="Cascadia Mono" w:hAnsi="Cascadia Mono" w:cs="Cascadia Mono"/>
+                <w:sz w:val="20"/>
+                <w:szCs w:val="20"/>
+              </w:rPr>
+              <w:t xml:space="preserve">     Лицензия.[Дата окончания],</w:t>
+            </w:r>
+          </w:p>
+          <w:p>
+            <w:pPr>
+              <w:ind w:firstLine="0"/>
+              <w:rPr>
+                <w:rFonts w:ascii="Cascadia Mono" w:hAnsi="Cascadia Mono" w:cs="Cascadia Mono"/>
+                <w:sz w:val="20"/>
+                <w:szCs w:val="20"/>
+              </w:rPr>
+            </w:pPr>
+            <w:r>
+              <w:rPr>
+                <w:rFonts w:ascii="Cascadia Mono" w:hAnsi="Cascadia Mono" w:cs="Cascadia Mono"/>
+                <w:sz w:val="20"/>
+                <w:szCs w:val="20"/>
+              </w:rPr>
+              <w:t xml:space="preserve">     Риэлтор.[Серия паспорта], </w:t>
+            </w:r>
+          </w:p>
+          <w:p>
+            <w:pPr>
+              <w:ind w:firstLine="0"/>
+              <w:rPr>
+                <w:rFonts w:ascii="Cascadia Mono" w:hAnsi="Cascadia Mono" w:cs="Cascadia Mono"/>
+                <w:sz w:val="20"/>
+                <w:szCs w:val="20"/>
+              </w:rPr>
+            </w:pPr>
+            <w:r>
+              <w:rPr>
+                <w:rFonts w:ascii="Cascadia Mono" w:hAnsi="Cascadia Mono" w:cs="Cascadia Mono"/>
+                <w:sz w:val="20"/>
+                <w:szCs w:val="20"/>
+              </w:rPr>
+              <w:t xml:space="preserve">     Риэлтор.[Номер паспорта], </w:t>
+            </w:r>
+          </w:p>
+          <w:p>
+            <w:pPr>
+              <w:ind w:firstLine="0"/>
+              <w:rPr>
+                <w:rFonts w:ascii="Cascadia Mono" w:hAnsi="Cascadia Mono" w:cs="Cascadia Mono"/>
+                <w:sz w:val="20"/>
+                <w:szCs w:val="20"/>
+              </w:rPr>
+            </w:pPr>
+            <w:r>
+              <w:rPr>
+                <w:rFonts w:ascii="Cascadia Mono" w:hAnsi="Cascadia Mono" w:cs="Cascadia Mono"/>
+                <w:sz w:val="20"/>
+                <w:szCs w:val="20"/>
+              </w:rPr>
+              <w:t xml:space="preserve">     Риэлтор.[ИНН],</w:t>
+            </w:r>
+          </w:p>
+          <w:p>
+            <w:pPr>
+              <w:ind w:firstLine="0"/>
+              <w:rPr>
+                <w:rFonts w:ascii="Cascadia Mono" w:hAnsi="Cascadia Mono" w:cs="Cascadia Mono"/>
+                <w:sz w:val="20"/>
+                <w:szCs w:val="20"/>
+              </w:rPr>
+            </w:pPr>
+            <w:r>
+              <w:rPr>
+                <w:rFonts w:ascii="Cascadia Mono" w:hAnsi="Cascadia Mono" w:cs="Cascadia Mono"/>
+                <w:sz w:val="20"/>
+                <w:szCs w:val="20"/>
+              </w:rPr>
+              <w:t xml:space="preserve">     Риэлтор.[Номер телефона],</w:t>
+            </w:r>
+          </w:p>
+          <w:p>
+            <w:pPr>
+              <w:ind w:firstLine="0"/>
+              <w:rPr>
+                <w:rFonts w:ascii="Cascadia Mono" w:hAnsi="Cascadia Mono" w:cs="Cascadia Mono"/>
+                <w:sz w:val="20"/>
+                <w:szCs w:val="20"/>
+              </w:rPr>
+            </w:pPr>
+            <w:r>
+              <w:rPr>
+                <w:rFonts w:ascii="Cascadia Mono" w:hAnsi="Cascadia Mono" w:cs="Cascadia Mono"/>
+                <w:sz w:val="20"/>
+                <w:szCs w:val="20"/>
+              </w:rPr>
+              <w:t xml:space="preserve">     Предложение.[Начальная стоимость],</w:t>
+            </w:r>
+          </w:p>
+          <w:p>
+            <w:pPr>
+              <w:ind w:firstLine="0"/>
+              <w:rPr>
+                <w:rFonts w:ascii="Cascadia Mono" w:hAnsi="Cascadia Mono" w:cs="Cascadia Mono"/>
+                <w:sz w:val="20"/>
+                <w:szCs w:val="20"/>
+              </w:rPr>
+            </w:pPr>
+            <w:r>
+              <w:rPr>
+                <w:rFonts w:ascii="Cascadia Mono" w:hAnsi="Cascadia Mono" w:cs="Cascadia Mono"/>
+                <w:sz w:val="20"/>
+                <w:szCs w:val="20"/>
+              </w:rPr>
+              <w:t xml:space="preserve">     Предложение.[Дата поступления],</w:t>
+            </w:r>
+          </w:p>
+          <w:p>
+            <w:pPr>
+              <w:ind w:firstLine="0"/>
+              <w:rPr>
+                <w:rFonts w:ascii="Cascadia Mono" w:hAnsi="Cascadia Mono" w:cs="Cascadia Mono"/>
+                <w:sz w:val="20"/>
+                <w:szCs w:val="20"/>
+              </w:rPr>
+            </w:pPr>
+            <w:r>
+              <w:rPr>
+                <w:rFonts w:ascii="Cascadia Mono" w:hAnsi="Cascadia Mono" w:cs="Cascadia Mono"/>
+                <w:sz w:val="20"/>
+                <w:szCs w:val="20"/>
+              </w:rPr>
+              <w:t xml:space="preserve">     Предложение.[Разрешены питомцы],</w:t>
+            </w:r>
+          </w:p>
+          <w:p>
+            <w:pPr>
+              <w:ind w:firstLine="0"/>
+              <w:rPr>
+                <w:rFonts w:ascii="Cascadia Mono" w:hAnsi="Cascadia Mono" w:cs="Cascadia Mono"/>
+                <w:sz w:val="20"/>
+                <w:szCs w:val="20"/>
+              </w:rPr>
+            </w:pPr>
+            <w:r>
+              <w:rPr>
+                <w:rFonts w:ascii="Cascadia Mono" w:hAnsi="Cascadia Mono" w:cs="Cascadia Mono"/>
+                <w:sz w:val="20"/>
+                <w:szCs w:val="20"/>
+              </w:rPr>
+              <w:t xml:space="preserve">     Предложение.[Разрешено курение],</w:t>
+            </w:r>
+          </w:p>
+          <w:p>
+            <w:pPr>
+              <w:ind w:firstLine="0"/>
+              <w:rPr>
+                <w:rFonts w:ascii="Cascadia Mono" w:hAnsi="Cascadia Mono" w:cs="Cascadia Mono"/>
+                <w:sz w:val="20"/>
+                <w:szCs w:val="20"/>
+              </w:rPr>
+            </w:pPr>
+            <w:r>
+              <w:rPr>
+                <w:rFonts w:ascii="Cascadia Mono" w:hAnsi="Cascadia Mono" w:cs="Cascadia Mono"/>
+                <w:sz w:val="20"/>
+                <w:szCs w:val="20"/>
+              </w:rPr>
+              <w:t xml:space="preserve">     Предложение.[Разрешены иногородние],</w:t>
+            </w:r>
+          </w:p>
+          <w:p>
+            <w:pPr>
+              <w:ind w:firstLine="0"/>
+              <w:rPr>
+                <w:rFonts w:ascii="Cascadia Mono" w:hAnsi="Cascadia Mono" w:cs="Cascadia Mono"/>
+                <w:sz w:val="20"/>
+                <w:szCs w:val="20"/>
+              </w:rPr>
+            </w:pPr>
+            <w:r>
+              <w:rPr>
+                <w:rFonts w:ascii="Cascadia Mono" w:hAnsi="Cascadia Mono" w:cs="Cascadia Mono"/>
+                <w:sz w:val="20"/>
+                <w:szCs w:val="20"/>
+              </w:rPr>
+              <w:t xml:space="preserve">     Предложение.[Разрешены иностранцы],</w:t>
+            </w:r>
+          </w:p>
+          <w:p>
+            <w:pPr>
+              <w:ind w:firstLine="0"/>
+              <w:rPr>
+                <w:rFonts w:ascii="Cascadia Mono" w:hAnsi="Cascadia Mono" w:cs="Cascadia Mono"/>
+                <w:sz w:val="20"/>
+                <w:szCs w:val="20"/>
+              </w:rPr>
+            </w:pPr>
+            <w:r>
+              <w:rPr>
+                <w:rFonts w:ascii="Cascadia Mono" w:hAnsi="Cascadia Mono" w:cs="Cascadia Mono"/>
+                <w:sz w:val="20"/>
+                <w:szCs w:val="20"/>
+              </w:rPr>
+              <w:t xml:space="preserve">     Предложение.[Разрешена смена интерьера],</w:t>
+            </w:r>
+          </w:p>
+          <w:p>
+            <w:pPr>
+              <w:ind w:firstLine="0"/>
+              <w:rPr>
+                <w:rFonts w:ascii="Cascadia Mono" w:hAnsi="Cascadia Mono" w:cs="Cascadia Mono"/>
+                <w:sz w:val="20"/>
+                <w:szCs w:val="20"/>
+              </w:rPr>
+            </w:pPr>
+            <w:r>
+              <w:rPr>
+                <w:rFonts w:ascii="Cascadia Mono" w:hAnsi="Cascadia Mono" w:cs="Cascadia Mono"/>
+                <w:sz w:val="20"/>
+                <w:szCs w:val="20"/>
+              </w:rPr>
+              <w:t xml:space="preserve">     Предложение.[Максимальное число человек],</w:t>
+            </w:r>
+          </w:p>
+          <w:p>
+            <w:pPr>
+              <w:ind w:firstLine="0"/>
+              <w:rPr>
+                <w:rFonts w:ascii="Cascadia Mono" w:hAnsi="Cascadia Mono" w:cs="Cascadia Mono"/>
+                <w:sz w:val="20"/>
+                <w:szCs w:val="20"/>
+              </w:rPr>
+            </w:pPr>
+            <w:r>
+              <w:rPr>
+                <w:rFonts w:ascii="Cascadia Mono" w:hAnsi="Cascadia Mono" w:cs="Cascadia Mono"/>
+                <w:sz w:val="20"/>
+                <w:szCs w:val="20"/>
+              </w:rPr>
+              <w:t xml:space="preserve">     Предложение.[Желаемый минимальный возраст],</w:t>
+            </w:r>
+          </w:p>
+          <w:p>
+            <w:pPr>
+              <w:ind w:firstLine="0"/>
+              <w:rPr>
+                <w:rFonts w:ascii="Cascadia Mono" w:hAnsi="Cascadia Mono" w:cs="Cascadia Mono"/>
+                <w:sz w:val="20"/>
+                <w:szCs w:val="20"/>
+              </w:rPr>
+            </w:pPr>
+            <w:r>
+              <w:rPr>
+                <w:rFonts w:ascii="Cascadia Mono" w:hAnsi="Cascadia Mono" w:cs="Cascadia Mono"/>
+                <w:sz w:val="20"/>
+                <w:szCs w:val="20"/>
+              </w:rPr>
+              <w:t xml:space="preserve">     Предложение.[Желаемый максимальный возраст],</w:t>
+            </w:r>
+          </w:p>
+          <w:p>
+            <w:pPr>
+              <w:ind w:firstLine="0"/>
+              <w:rPr>
+                <w:rFonts w:ascii="Cascadia Mono" w:hAnsi="Cascadia Mono" w:cs="Cascadia Mono"/>
+                <w:sz w:val="20"/>
+                <w:szCs w:val="20"/>
+              </w:rPr>
+            </w:pPr>
+            <w:r>
+              <w:rPr>
+                <w:rFonts w:ascii="Cascadia Mono" w:hAnsi="Cascadia Mono" w:cs="Cascadia Mono"/>
+                <w:sz w:val="20"/>
+                <w:szCs w:val="20"/>
+              </w:rPr>
+              <w:t xml:space="preserve">     Квартира.[Кадастровый номер],</w:t>
+            </w:r>
+          </w:p>
+          <w:p>
+            <w:pPr>
+              <w:ind w:firstLine="0"/>
+              <w:rPr>
+                <w:rFonts w:ascii="Cascadia Mono" w:hAnsi="Cascadia Mono" w:cs="Cascadia Mono"/>
+                <w:sz w:val="20"/>
+                <w:szCs w:val="20"/>
+              </w:rPr>
+            </w:pPr>
+            <w:r>
+              <w:rPr>
+                <w:rFonts w:ascii="Cascadia Mono" w:hAnsi="Cascadia Mono" w:cs="Cascadia Mono"/>
+                <w:sz w:val="20"/>
+                <w:szCs w:val="20"/>
+              </w:rPr>
+              <w:t xml:space="preserve">     Дом.[Номер],</w:t>
+            </w:r>
+          </w:p>
+          <w:p>
+            <w:pPr>
+              <w:ind w:firstLine="0"/>
+              <w:rPr>
+                <w:rFonts w:ascii="Cascadia Mono" w:hAnsi="Cascadia Mono" w:cs="Cascadia Mono"/>
+                <w:sz w:val="20"/>
+                <w:szCs w:val="20"/>
+              </w:rPr>
+            </w:pPr>
+            <w:r>
+              <w:rPr>
+                <w:rFonts w:ascii="Cascadia Mono" w:hAnsi="Cascadia Mono" w:cs="Cascadia Mono"/>
+                <w:sz w:val="20"/>
+                <w:szCs w:val="20"/>
+              </w:rPr>
+              <w:t xml:space="preserve">     Улица.[Наименование],</w:t>
+            </w:r>
+          </w:p>
+          <w:p>
+            <w:pPr>
+              <w:ind w:firstLine="0"/>
+              <w:rPr>
+                <w:rFonts w:ascii="Cascadia Mono" w:hAnsi="Cascadia Mono" w:cs="Cascadia Mono"/>
+                <w:sz w:val="20"/>
+                <w:szCs w:val="20"/>
+              </w:rPr>
+            </w:pPr>
+            <w:r>
+              <w:rPr>
+                <w:rFonts w:ascii="Cascadia Mono" w:hAnsi="Cascadia Mono" w:cs="Cascadia Mono"/>
+                <w:sz w:val="20"/>
+                <w:szCs w:val="20"/>
+              </w:rPr>
+              <w:t xml:space="preserve">     Квартира.[Подъезд],</w:t>
+            </w:r>
+          </w:p>
+          <w:p>
+            <w:pPr>
+              <w:ind w:firstLine="0"/>
+              <w:rPr>
+                <w:rFonts w:ascii="Cascadia Mono" w:hAnsi="Cascadia Mono" w:cs="Cascadia Mono"/>
+                <w:sz w:val="20"/>
+                <w:szCs w:val="20"/>
+              </w:rPr>
+            </w:pPr>
+            <w:r>
+              <w:rPr>
+                <w:rFonts w:ascii="Cascadia Mono" w:hAnsi="Cascadia Mono" w:cs="Cascadia Mono"/>
+                <w:sz w:val="20"/>
+                <w:szCs w:val="20"/>
+              </w:rPr>
+              <w:t xml:space="preserve">     Квартира.[Номер],</w:t>
+            </w:r>
+          </w:p>
+          <w:p>
+            <w:pPr>
+              <w:ind w:firstLine="0"/>
+              <w:rPr>
+                <w:rFonts w:ascii="Cascadia Mono" w:hAnsi="Cascadia Mono" w:cs="Cascadia Mono"/>
+                <w:sz w:val="20"/>
+                <w:szCs w:val="20"/>
+              </w:rPr>
+            </w:pPr>
+            <w:r>
+              <w:rPr>
+                <w:rFonts w:ascii="Cascadia Mono" w:hAnsi="Cascadia Mono" w:cs="Cascadia Mono"/>
+                <w:sz w:val="20"/>
+                <w:szCs w:val="20"/>
+              </w:rPr>
+              <w:t xml:space="preserve">     Квартира.[Этаж],</w:t>
+            </w:r>
+          </w:p>
+          <w:p>
+            <w:pPr>
+              <w:ind w:firstLine="0"/>
+              <w:rPr>
+                <w:rFonts w:ascii="Cascadia Mono" w:hAnsi="Cascadia Mono" w:cs="Cascadia Mono"/>
+                <w:sz w:val="20"/>
+                <w:szCs w:val="20"/>
+              </w:rPr>
+            </w:pPr>
+            <w:r>
+              <w:rPr>
+                <w:rFonts w:ascii="Cascadia Mono" w:hAnsi="Cascadia Mono" w:cs="Cascadia Mono"/>
+                <w:sz w:val="20"/>
+                <w:szCs w:val="20"/>
+              </w:rPr>
+              <w:t xml:space="preserve">     Квартира.[Комнат],</w:t>
+            </w:r>
+          </w:p>
+          <w:p>
+            <w:pPr>
+              <w:ind w:firstLine="0"/>
+              <w:rPr>
+                <w:rFonts w:ascii="Cascadia Mono" w:hAnsi="Cascadia Mono" w:cs="Cascadia Mono"/>
+                <w:sz w:val="20"/>
+                <w:szCs w:val="20"/>
+              </w:rPr>
+            </w:pPr>
+            <w:r>
+              <w:rPr>
+                <w:rFonts w:ascii="Cascadia Mono" w:hAnsi="Cascadia Mono" w:cs="Cascadia Mono"/>
+                <w:sz w:val="20"/>
+                <w:szCs w:val="20"/>
+              </w:rPr>
+              <w:t xml:space="preserve">     Квартира.[Площадь],</w:t>
+            </w:r>
+          </w:p>
+          <w:p>
+            <w:pPr>
+              <w:ind w:firstLine="0"/>
+              <w:rPr>
+                <w:rFonts w:ascii="Cascadia Mono" w:hAnsi="Cascadia Mono" w:cs="Cascadia Mono"/>
+                <w:sz w:val="20"/>
+                <w:szCs w:val="20"/>
+              </w:rPr>
+            </w:pPr>
+            <w:r>
+              <w:rPr>
+                <w:rFonts w:ascii="Cascadia Mono" w:hAnsi="Cascadia Mono" w:cs="Cascadia Mono"/>
+                <w:sz w:val="20"/>
+                <w:szCs w:val="20"/>
+              </w:rPr>
+              <w:t xml:space="preserve">     Квартира.[Наличие лоджии],</w:t>
+            </w:r>
+          </w:p>
+          <w:p>
+            <w:pPr>
+              <w:ind w:firstLine="0"/>
+              <w:rPr>
+                <w:rFonts w:ascii="Cascadia Mono" w:hAnsi="Cascadia Mono" w:cs="Cascadia Mono"/>
+                <w:sz w:val="20"/>
+                <w:szCs w:val="20"/>
+              </w:rPr>
+            </w:pPr>
+            <w:r>
+              <w:rPr>
+                <w:rFonts w:ascii="Cascadia Mono" w:hAnsi="Cascadia Mono" w:cs="Cascadia Mono"/>
+                <w:sz w:val="20"/>
+                <w:szCs w:val="20"/>
+              </w:rPr>
+              <w:t xml:space="preserve">     [Тип пола].[Тип пола],</w:t>
+            </w:r>
+          </w:p>
+          <w:p>
+            <w:pPr>
+              <w:ind w:firstLine="0"/>
+              <w:rPr>
+                <w:rFonts w:ascii="Cascadia Mono" w:hAnsi="Cascadia Mono" w:cs="Cascadia Mono"/>
+                <w:sz w:val="20"/>
+                <w:szCs w:val="20"/>
+              </w:rPr>
+            </w:pPr>
+            <w:r>
+              <w:rPr>
+                <w:rFonts w:ascii="Cascadia Mono" w:hAnsi="Cascadia Mono" w:cs="Cascadia Mono"/>
+                <w:sz w:val="20"/>
+                <w:szCs w:val="20"/>
+              </w:rPr>
+              <w:t xml:space="preserve">     [Тип прибора приготовления пищи].[Тип прибора приготовления пищи],</w:t>
+            </w:r>
+          </w:p>
+          <w:p>
+            <w:pPr>
+              <w:ind w:firstLine="0"/>
+              <w:rPr>
+                <w:rFonts w:ascii="Cascadia Mono" w:hAnsi="Cascadia Mono" w:cs="Cascadia Mono"/>
+                <w:sz w:val="20"/>
+                <w:szCs w:val="20"/>
+              </w:rPr>
+            </w:pPr>
+            <w:r>
+              <w:rPr>
+                <w:rFonts w:ascii="Cascadia Mono" w:hAnsi="Cascadia Mono" w:cs="Cascadia Mono"/>
+                <w:sz w:val="20"/>
+                <w:szCs w:val="20"/>
+              </w:rPr>
+              <w:t xml:space="preserve">     [Тип задолженности].[Тип задолженности],</w:t>
+            </w:r>
+          </w:p>
+          <w:p>
+            <w:pPr>
+              <w:ind w:firstLine="0"/>
+              <w:rPr>
+                <w:rFonts w:ascii="Cascadia Mono" w:hAnsi="Cascadia Mono" w:cs="Cascadia Mono"/>
+                <w:sz w:val="20"/>
+                <w:szCs w:val="20"/>
+              </w:rPr>
+            </w:pPr>
+            <w:r>
+              <w:rPr>
+                <w:rFonts w:ascii="Cascadia Mono" w:hAnsi="Cascadia Mono" w:cs="Cascadia Mono"/>
+                <w:sz w:val="20"/>
+                <w:szCs w:val="20"/>
+              </w:rPr>
+              <w:t xml:space="preserve">     Квартира.[Сумма задолженности],</w:t>
+            </w:r>
+          </w:p>
+          <w:p>
+            <w:pPr>
+              <w:ind w:firstLine="0"/>
+              <w:rPr>
+                <w:rFonts w:ascii="Cascadia Mono" w:hAnsi="Cascadia Mono" w:cs="Cascadia Mono"/>
+                <w:sz w:val="20"/>
+                <w:szCs w:val="20"/>
+              </w:rPr>
+            </w:pPr>
+            <w:r>
+              <w:rPr>
+                <w:rFonts w:ascii="Cascadia Mono" w:hAnsi="Cascadia Mono" w:cs="Cascadia Mono"/>
+                <w:sz w:val="20"/>
+                <w:szCs w:val="20"/>
+              </w:rPr>
+              <w:t xml:space="preserve">     [Тип ограничения].[Тип ограничения],</w:t>
+            </w:r>
+          </w:p>
+          <w:p>
+            <w:pPr>
+              <w:ind w:firstLine="0"/>
+              <w:rPr>
+                <w:rFonts w:ascii="Cascadia Mono" w:hAnsi="Cascadia Mono" w:cs="Cascadia Mono"/>
+                <w:sz w:val="20"/>
+                <w:szCs w:val="20"/>
+              </w:rPr>
+            </w:pPr>
+            <w:r>
+              <w:rPr>
+                <w:rFonts w:ascii="Cascadia Mono" w:hAnsi="Cascadia Mono" w:cs="Cascadia Mono"/>
+                <w:sz w:val="20"/>
+                <w:szCs w:val="20"/>
+              </w:rPr>
+              <w:t xml:space="preserve">     Квартира.[Кадастровая стоимость],</w:t>
+            </w:r>
+          </w:p>
+          <w:p>
+            <w:pPr>
+              <w:ind w:firstLine="0"/>
+              <w:rPr>
+                <w:rFonts w:ascii="Cascadia Mono" w:hAnsi="Cascadia Mono" w:cs="Cascadia Mono"/>
+                <w:sz w:val="20"/>
+                <w:szCs w:val="20"/>
+              </w:rPr>
+            </w:pPr>
+            <w:r>
+              <w:rPr>
+                <w:rFonts w:ascii="Cascadia Mono" w:hAnsi="Cascadia Mono" w:cs="Cascadia Mono"/>
+                <w:sz w:val="20"/>
+                <w:szCs w:val="20"/>
+              </w:rPr>
+              <w:lastRenderedPageBreak/>
+              <w:t xml:space="preserve">     Дом.[Дата постройки],</w:t>
+            </w:r>
+          </w:p>
+          <w:p>
+            <w:pPr>
+              <w:ind w:firstLine="0"/>
+              <w:rPr>
+                <w:rFonts w:ascii="Cascadia Mono" w:hAnsi="Cascadia Mono" w:cs="Cascadia Mono"/>
+                <w:sz w:val="20"/>
+                <w:szCs w:val="20"/>
+              </w:rPr>
+            </w:pPr>
+            <w:r>
+              <w:rPr>
+                <w:rFonts w:ascii="Cascadia Mono" w:hAnsi="Cascadia Mono" w:cs="Cascadia Mono"/>
+                <w:sz w:val="20"/>
+                <w:szCs w:val="20"/>
+              </w:rPr>
+              <w:t xml:space="preserve">     Дом.[Этажей],</w:t>
+            </w:r>
+          </w:p>
+          <w:p>
+            <w:pPr>
+              <w:ind w:firstLine="0"/>
+              <w:rPr>
+                <w:rFonts w:ascii="Cascadia Mono" w:hAnsi="Cascadia Mono" w:cs="Cascadia Mono"/>
+                <w:sz w:val="20"/>
+                <w:szCs w:val="20"/>
+              </w:rPr>
+            </w:pPr>
+            <w:r>
+              <w:rPr>
+                <w:rFonts w:ascii="Cascadia Mono" w:hAnsi="Cascadia Mono" w:cs="Cascadia Mono"/>
+                <w:sz w:val="20"/>
+                <w:szCs w:val="20"/>
+              </w:rPr>
+              <w:t xml:space="preserve">     Дом.[Подъездов],</w:t>
+            </w:r>
+          </w:p>
+          <w:p>
+            <w:pPr>
+              <w:ind w:firstLine="0"/>
+              <w:rPr>
+                <w:rFonts w:ascii="Cascadia Mono" w:hAnsi="Cascadia Mono" w:cs="Cascadia Mono"/>
+                <w:sz w:val="20"/>
+                <w:szCs w:val="20"/>
+              </w:rPr>
+            </w:pPr>
+            <w:r>
+              <w:rPr>
+                <w:rFonts w:ascii="Cascadia Mono" w:hAnsi="Cascadia Mono" w:cs="Cascadia Mono"/>
+                <w:sz w:val="20"/>
+                <w:szCs w:val="20"/>
+              </w:rPr>
+              <w:t xml:space="preserve">     Дом.[Наличие лифта],</w:t>
+            </w:r>
+          </w:p>
+          <w:p>
+            <w:pPr>
+              <w:ind w:firstLine="0"/>
+              <w:rPr>
+                <w:rFonts w:ascii="Cascadia Mono" w:hAnsi="Cascadia Mono" w:cs="Cascadia Mono"/>
+                <w:sz w:val="20"/>
+                <w:szCs w:val="20"/>
+              </w:rPr>
+            </w:pPr>
+            <w:r>
+              <w:rPr>
+                <w:rFonts w:ascii="Cascadia Mono" w:hAnsi="Cascadia Mono" w:cs="Cascadia Mono"/>
+                <w:sz w:val="20"/>
+                <w:szCs w:val="20"/>
+              </w:rPr>
+              <w:t xml:space="preserve">     Дом.[Наличие мусоропровода],</w:t>
+            </w:r>
+          </w:p>
+          <w:p>
+            <w:pPr>
+              <w:ind w:firstLine="0"/>
+              <w:rPr>
+                <w:rFonts w:ascii="Cascadia Mono" w:hAnsi="Cascadia Mono" w:cs="Cascadia Mono"/>
+                <w:sz w:val="20"/>
+                <w:szCs w:val="20"/>
+              </w:rPr>
+            </w:pPr>
+            <w:r>
+              <w:rPr>
+                <w:rFonts w:ascii="Cascadia Mono" w:hAnsi="Cascadia Mono" w:cs="Cascadia Mono"/>
+                <w:sz w:val="20"/>
+                <w:szCs w:val="20"/>
+              </w:rPr>
+              <w:t xml:space="preserve">     [Материал стен].[Материал стен],</w:t>
+            </w:r>
+          </w:p>
+          <w:p>
+            <w:pPr>
+              <w:ind w:firstLine="0"/>
+              <w:rPr>
+                <w:rFonts w:ascii="Cascadia Mono" w:hAnsi="Cascadia Mono" w:cs="Cascadia Mono"/>
+                <w:sz w:val="20"/>
+                <w:szCs w:val="20"/>
+              </w:rPr>
+            </w:pPr>
+            <w:r>
+              <w:rPr>
+                <w:rFonts w:ascii="Cascadia Mono" w:hAnsi="Cascadia Mono" w:cs="Cascadia Mono"/>
+                <w:sz w:val="20"/>
+                <w:szCs w:val="20"/>
+              </w:rPr>
+              <w:t xml:space="preserve">     [Тип отопления].[Тип отопления],</w:t>
+            </w:r>
+          </w:p>
+          <w:p>
+            <w:pPr>
+              <w:ind w:firstLine="0"/>
+              <w:rPr>
+                <w:rFonts w:ascii="Cascadia Mono" w:hAnsi="Cascadia Mono" w:cs="Cascadia Mono"/>
+                <w:sz w:val="20"/>
+                <w:szCs w:val="20"/>
+              </w:rPr>
+            </w:pPr>
+            <w:r>
+              <w:rPr>
+                <w:rFonts w:ascii="Cascadia Mono" w:hAnsi="Cascadia Mono" w:cs="Cascadia Mono"/>
+                <w:sz w:val="20"/>
+                <w:szCs w:val="20"/>
+              </w:rPr>
+              <w:t xml:space="preserve">     [Тип домоуправления].[Тип домоуправления],</w:t>
+            </w:r>
+          </w:p>
+          <w:p>
+            <w:pPr>
+              <w:ind w:firstLine="0"/>
+              <w:rPr>
+                <w:rFonts w:ascii="Cascadia Mono" w:hAnsi="Cascadia Mono" w:cs="Cascadia Mono"/>
+                <w:sz w:val="20"/>
+                <w:szCs w:val="20"/>
+              </w:rPr>
+            </w:pPr>
+            <w:r>
+              <w:rPr>
+                <w:rFonts w:ascii="Cascadia Mono" w:hAnsi="Cascadia Mono" w:cs="Cascadia Mono"/>
+                <w:sz w:val="20"/>
+                <w:szCs w:val="20"/>
+              </w:rPr>
+              <w:t xml:space="preserve">     [Улица].[Удалённость от центра],</w:t>
+            </w:r>
+          </w:p>
+          <w:p>
+            <w:pPr>
+              <w:ind w:firstLine="0"/>
+              <w:rPr>
+                <w:rFonts w:ascii="Cascadia Mono" w:hAnsi="Cascadia Mono" w:cs="Cascadia Mono"/>
+                <w:sz w:val="20"/>
+                <w:szCs w:val="20"/>
+              </w:rPr>
+            </w:pPr>
+            <w:r>
+              <w:rPr>
+                <w:rFonts w:ascii="Cascadia Mono" w:hAnsi="Cascadia Mono" w:cs="Cascadia Mono"/>
+                <w:sz w:val="20"/>
+                <w:szCs w:val="20"/>
+              </w:rPr>
+              <w:t xml:space="preserve">     [Квартал].[Кадастровый номер],</w:t>
+            </w:r>
+          </w:p>
+          <w:p>
+            <w:pPr>
+              <w:ind w:firstLine="0"/>
+              <w:rPr>
+                <w:rFonts w:ascii="Cascadia Mono" w:hAnsi="Cascadia Mono" w:cs="Cascadia Mono"/>
+                <w:sz w:val="20"/>
+                <w:szCs w:val="20"/>
+              </w:rPr>
+            </w:pPr>
+            <w:r>
+              <w:rPr>
+                <w:rFonts w:ascii="Cascadia Mono" w:hAnsi="Cascadia Mono" w:cs="Cascadia Mono"/>
+                <w:sz w:val="20"/>
+                <w:szCs w:val="20"/>
+              </w:rPr>
+              <w:t xml:space="preserve">     [Квартал].[Наличие детского сада],</w:t>
+            </w:r>
+          </w:p>
+          <w:p>
+            <w:pPr>
+              <w:ind w:firstLine="0"/>
+              <w:rPr>
+                <w:rFonts w:ascii="Cascadia Mono" w:hAnsi="Cascadia Mono" w:cs="Cascadia Mono"/>
+                <w:sz w:val="20"/>
+                <w:szCs w:val="20"/>
+              </w:rPr>
+            </w:pPr>
+            <w:r>
+              <w:rPr>
+                <w:rFonts w:ascii="Cascadia Mono" w:hAnsi="Cascadia Mono" w:cs="Cascadia Mono"/>
+                <w:sz w:val="20"/>
+                <w:szCs w:val="20"/>
+              </w:rPr>
+              <w:t xml:space="preserve">     [Квартал].[Наличие школы]</w:t>
+            </w:r>
+          </w:p>
+          <w:p>
+            <w:pPr>
+              <w:ind w:firstLine="0"/>
+              <w:rPr>
+                <w:rFonts w:ascii="Cascadia Mono" w:hAnsi="Cascadia Mono" w:cs="Cascadia Mono"/>
+                <w:sz w:val="20"/>
+                <w:szCs w:val="20"/>
+              </w:rPr>
+            </w:pPr>
+            <w:r>
+              <w:rPr>
+                <w:rFonts w:ascii="Cascadia Mono" w:hAnsi="Cascadia Mono" w:cs="Cascadia Mono"/>
+                <w:sz w:val="20"/>
+                <w:szCs w:val="20"/>
+              </w:rPr>
+              <w:t xml:space="preserve">FROM ((((((((((((((((Сделка </w:t>
+            </w:r>
+          </w:p>
+          <w:p>
+            <w:pPr>
+              <w:ind w:firstLine="0"/>
+              <w:rPr>
+                <w:rFonts w:ascii="Cascadia Mono" w:hAnsi="Cascadia Mono" w:cs="Cascadia Mono"/>
+                <w:sz w:val="20"/>
+                <w:szCs w:val="20"/>
+              </w:rPr>
+            </w:pPr>
+            <w:r>
+              <w:rPr>
+                <w:rFonts w:ascii="Cascadia Mono" w:hAnsi="Cascadia Mono" w:cs="Cascadia Mono"/>
+                <w:sz w:val="20"/>
+                <w:szCs w:val="20"/>
+              </w:rPr>
+              <w:t xml:space="preserve">LEFT JOIN [Риэлтор] ON [Сделка].[Код риэлтора] = [Риэлтор].[Код риэлтора]) </w:t>
+            </w:r>
+          </w:p>
+          <w:p>
+            <w:pPr>
+              <w:ind w:firstLine="0"/>
+              <w:rPr>
+                <w:rFonts w:ascii="Cascadia Mono" w:hAnsi="Cascadia Mono" w:cs="Cascadia Mono"/>
+                <w:sz w:val="20"/>
+                <w:szCs w:val="20"/>
+              </w:rPr>
+            </w:pPr>
+            <w:r>
+              <w:rPr>
+                <w:rFonts w:ascii="Cascadia Mono" w:hAnsi="Cascadia Mono" w:cs="Cascadia Mono"/>
+                <w:sz w:val="20"/>
+                <w:szCs w:val="20"/>
+              </w:rPr>
+              <w:t xml:space="preserve">LEFT JOIN [Владелец] ON [Сделка].[Код владельца] = [Владелец].[Код владельца]) </w:t>
+            </w:r>
+          </w:p>
+          <w:p>
+            <w:pPr>
+              <w:ind w:firstLine="0"/>
+              <w:rPr>
+                <w:rFonts w:ascii="Cascadia Mono" w:hAnsi="Cascadia Mono" w:cs="Cascadia Mono"/>
+                <w:sz w:val="20"/>
+                <w:szCs w:val="20"/>
+              </w:rPr>
+            </w:pPr>
+            <w:r>
+              <w:rPr>
+                <w:rFonts w:ascii="Cascadia Mono" w:hAnsi="Cascadia Mono" w:cs="Cascadia Mono"/>
+                <w:sz w:val="20"/>
+                <w:szCs w:val="20"/>
+              </w:rPr>
+              <w:t xml:space="preserve">LEFT JOIN [Покупатель] ON [Сделка].[Код покупателя] = [Покупатель].[Код покупателя]) </w:t>
+            </w:r>
+          </w:p>
+          <w:p>
+            <w:pPr>
+              <w:ind w:firstLine="0"/>
+              <w:rPr>
+                <w:rFonts w:ascii="Cascadia Mono" w:hAnsi="Cascadia Mono" w:cs="Cascadia Mono"/>
+                <w:sz w:val="20"/>
+                <w:szCs w:val="20"/>
+              </w:rPr>
+            </w:pPr>
+            <w:r>
+              <w:rPr>
+                <w:rFonts w:ascii="Cascadia Mono" w:hAnsi="Cascadia Mono" w:cs="Cascadia Mono"/>
+                <w:sz w:val="20"/>
+                <w:szCs w:val="20"/>
+              </w:rPr>
+              <w:t>LEFT JOIN [Лицензия] ON [Риэлтор].[Номер лицензии] = [Лицензия].[Номер лицензии])</w:t>
+            </w:r>
+          </w:p>
+          <w:p>
+            <w:pPr>
+              <w:ind w:firstLine="0"/>
+              <w:rPr>
+                <w:rFonts w:ascii="Cascadia Mono" w:hAnsi="Cascadia Mono" w:cs="Cascadia Mono"/>
+                <w:sz w:val="20"/>
+                <w:szCs w:val="20"/>
+              </w:rPr>
+            </w:pPr>
+            <w:r>
+              <w:rPr>
+                <w:rFonts w:ascii="Cascadia Mono" w:hAnsi="Cascadia Mono" w:cs="Cascadia Mono"/>
+                <w:sz w:val="20"/>
+                <w:szCs w:val="20"/>
+              </w:rPr>
+              <w:t>LEFT JOIN [Предложение] ON [Сделка].[Номер предложения] = [Предложение].[Номер предложения])</w:t>
+            </w:r>
+          </w:p>
+          <w:p>
+            <w:pPr>
+              <w:ind w:firstLine="0"/>
+              <w:rPr>
+                <w:rFonts w:ascii="Cascadia Mono" w:hAnsi="Cascadia Mono" w:cs="Cascadia Mono"/>
+                <w:sz w:val="20"/>
+                <w:szCs w:val="20"/>
+              </w:rPr>
+            </w:pPr>
+            <w:r>
+              <w:rPr>
+                <w:rFonts w:ascii="Cascadia Mono" w:hAnsi="Cascadia Mono" w:cs="Cascadia Mono"/>
+                <w:sz w:val="20"/>
+                <w:szCs w:val="20"/>
+              </w:rPr>
+              <w:t>LEFT JOIN [Статус сделки] ON [Сделка].[Код статуса сделки] = [Статус сделки].[Код статуса сделки])</w:t>
+            </w:r>
+          </w:p>
+          <w:p>
+            <w:pPr>
+              <w:ind w:firstLine="0"/>
+              <w:rPr>
+                <w:rFonts w:ascii="Cascadia Mono" w:hAnsi="Cascadia Mono" w:cs="Cascadia Mono"/>
+                <w:sz w:val="20"/>
+                <w:szCs w:val="20"/>
+              </w:rPr>
+            </w:pPr>
+            <w:r>
+              <w:rPr>
+                <w:rFonts w:ascii="Cascadia Mono" w:hAnsi="Cascadia Mono" w:cs="Cascadia Mono"/>
+                <w:sz w:val="20"/>
+                <w:szCs w:val="20"/>
+              </w:rPr>
+              <w:t>LEFT JOIN [Квартира] ON [Предложение].[Код квартиры] = [Квартира].[Код квартиры])</w:t>
+            </w:r>
+          </w:p>
+          <w:p>
+            <w:pPr>
+              <w:ind w:firstLine="0"/>
+              <w:rPr>
+                <w:rFonts w:ascii="Cascadia Mono" w:hAnsi="Cascadia Mono" w:cs="Cascadia Mono"/>
+                <w:sz w:val="20"/>
+                <w:szCs w:val="20"/>
+              </w:rPr>
+            </w:pPr>
+            <w:r>
+              <w:rPr>
+                <w:rFonts w:ascii="Cascadia Mono" w:hAnsi="Cascadia Mono" w:cs="Cascadia Mono"/>
+                <w:sz w:val="20"/>
+                <w:szCs w:val="20"/>
+              </w:rPr>
+              <w:t>LEFT JOIN [Тип пола] ON [Квартира].[Код типа пола] = [Тип пола].[Код типа пола])</w:t>
+            </w:r>
+          </w:p>
+          <w:p>
+            <w:pPr>
+              <w:ind w:firstLine="0"/>
+              <w:rPr>
+                <w:rFonts w:ascii="Cascadia Mono" w:hAnsi="Cascadia Mono" w:cs="Cascadia Mono"/>
+                <w:sz w:val="20"/>
+                <w:szCs w:val="20"/>
+              </w:rPr>
+            </w:pPr>
+            <w:r>
+              <w:rPr>
+                <w:rFonts w:ascii="Cascadia Mono" w:hAnsi="Cascadia Mono" w:cs="Cascadia Mono"/>
+                <w:sz w:val="20"/>
+                <w:szCs w:val="20"/>
+              </w:rPr>
+              <w:t>LEFT JOIN [Тип прибора приготовления пищи] ON [Квартира].[Код типа прибора приготовления пищи] = [Тип прибора приготовления пищи].[Код типа прибора приготовления пищи])</w:t>
+            </w:r>
+          </w:p>
+          <w:p>
+            <w:pPr>
+              <w:ind w:firstLine="0"/>
+              <w:rPr>
+                <w:rFonts w:ascii="Cascadia Mono" w:hAnsi="Cascadia Mono" w:cs="Cascadia Mono"/>
+                <w:sz w:val="20"/>
+                <w:szCs w:val="20"/>
+              </w:rPr>
+            </w:pPr>
+            <w:r>
+              <w:rPr>
+                <w:rFonts w:ascii="Cascadia Mono" w:hAnsi="Cascadia Mono" w:cs="Cascadia Mono"/>
+                <w:sz w:val="20"/>
+                <w:szCs w:val="20"/>
+              </w:rPr>
+              <w:t>LEFT JOIN [Тип задолженности] ON [Квартира].[Код типа задолженности] = [Тип задолженности].[Код типа задолженности])</w:t>
+            </w:r>
+          </w:p>
+          <w:p>
+            <w:pPr>
+              <w:ind w:firstLine="0"/>
+              <w:rPr>
+                <w:rFonts w:ascii="Cascadia Mono" w:hAnsi="Cascadia Mono" w:cs="Cascadia Mono"/>
+                <w:sz w:val="20"/>
+                <w:szCs w:val="20"/>
+              </w:rPr>
+            </w:pPr>
+            <w:r>
+              <w:rPr>
+                <w:rFonts w:ascii="Cascadia Mono" w:hAnsi="Cascadia Mono" w:cs="Cascadia Mono"/>
+                <w:sz w:val="20"/>
+                <w:szCs w:val="20"/>
+              </w:rPr>
+              <w:t>LEFT JOIN [Тип ограничения] ON [Квартира].[Код типа ограничения] = [Тип ограничения].[Код типа ограничения])</w:t>
+            </w:r>
+          </w:p>
+          <w:p>
+            <w:pPr>
+              <w:ind w:firstLine="0"/>
+              <w:rPr>
+                <w:rFonts w:ascii="Cascadia Mono" w:hAnsi="Cascadia Mono" w:cs="Cascadia Mono"/>
+                <w:sz w:val="20"/>
+                <w:szCs w:val="20"/>
+              </w:rPr>
+            </w:pPr>
+            <w:r>
+              <w:rPr>
+                <w:rFonts w:ascii="Cascadia Mono" w:hAnsi="Cascadia Mono" w:cs="Cascadia Mono"/>
+                <w:sz w:val="20"/>
+                <w:szCs w:val="20"/>
+              </w:rPr>
+              <w:t>LEFT JOIN [Дом] ON [Квартира].[Код дома] = [Дом].[Код дома])</w:t>
+            </w:r>
+          </w:p>
+          <w:p>
+            <w:pPr>
+              <w:ind w:firstLine="0"/>
+              <w:rPr>
+                <w:rFonts w:ascii="Cascadia Mono" w:hAnsi="Cascadia Mono" w:cs="Cascadia Mono"/>
+                <w:sz w:val="20"/>
+                <w:szCs w:val="20"/>
+              </w:rPr>
+            </w:pPr>
+            <w:r>
+              <w:rPr>
+                <w:rFonts w:ascii="Cascadia Mono" w:hAnsi="Cascadia Mono" w:cs="Cascadia Mono"/>
+                <w:sz w:val="20"/>
+                <w:szCs w:val="20"/>
+              </w:rPr>
+              <w:t>LEFT JOIN [Материал стен] ON [Дом].[Код материала стен] = [Материал стен].[Код материала стен])</w:t>
+            </w:r>
+          </w:p>
+          <w:p>
+            <w:pPr>
+              <w:ind w:firstLine="0"/>
+              <w:rPr>
+                <w:rFonts w:ascii="Cascadia Mono" w:hAnsi="Cascadia Mono" w:cs="Cascadia Mono"/>
+                <w:sz w:val="20"/>
+                <w:szCs w:val="20"/>
+              </w:rPr>
+            </w:pPr>
+            <w:r>
+              <w:rPr>
+                <w:rFonts w:ascii="Cascadia Mono" w:hAnsi="Cascadia Mono" w:cs="Cascadia Mono"/>
+                <w:sz w:val="20"/>
+                <w:szCs w:val="20"/>
+              </w:rPr>
+              <w:t>LEFT JOIN [Тип отопления] ON [Дом].[Код типа отопления] = [Тип отопления].[Код типа отопления])</w:t>
+            </w:r>
+          </w:p>
+          <w:p>
+            <w:pPr>
+              <w:ind w:firstLine="0"/>
+              <w:rPr>
+                <w:rFonts w:ascii="Cascadia Mono" w:hAnsi="Cascadia Mono" w:cs="Cascadia Mono"/>
+                <w:sz w:val="20"/>
+                <w:szCs w:val="20"/>
+              </w:rPr>
+            </w:pPr>
+            <w:r>
+              <w:rPr>
+                <w:rFonts w:ascii="Cascadia Mono" w:hAnsi="Cascadia Mono" w:cs="Cascadia Mono"/>
+                <w:sz w:val="20"/>
+                <w:szCs w:val="20"/>
+              </w:rPr>
+              <w:t>LEFT JOIN [Тип домоуправления] ON [Дом].[Код типа домоуправления] = [Тип домоуправления].[Код типа домоуправления])</w:t>
+            </w:r>
+          </w:p>
+          <w:p>
+            <w:pPr>
+              <w:ind w:firstLine="0"/>
+              <w:rPr>
+                <w:rFonts w:ascii="Cascadia Mono" w:hAnsi="Cascadia Mono" w:cs="Cascadia Mono"/>
+                <w:sz w:val="20"/>
+                <w:szCs w:val="20"/>
+              </w:rPr>
+            </w:pPr>
+            <w:r>
+              <w:rPr>
+                <w:rFonts w:ascii="Cascadia Mono" w:hAnsi="Cascadia Mono" w:cs="Cascadia Mono"/>
+                <w:sz w:val="20"/>
+                <w:szCs w:val="20"/>
+              </w:rPr>
+              <w:t>LEFT JOIN [Улица] ON [Дом].[Код улицы] = [Улица].[Код улицы])</w:t>
+            </w:r>
+          </w:p>
+          <w:p>
+            <w:pPr>
+              <w:ind w:firstLine="0"/>
+            </w:pPr>
+            <w:r>
+              <w:rPr>
+                <w:rFonts w:ascii="Cascadia Mono" w:hAnsi="Cascadia Mono" w:cs="Cascadia Mono"/>
+                <w:sz w:val="20"/>
+                <w:szCs w:val="20"/>
+              </w:rPr>
+              <w:t>LEFT JOIN [Квартал] ON [Улица].[Код квартала] = [Квартал].[Код квартала];</w:t>
             </w:r>
           </w:p>
         </w:tc>
@@ -21456,9 +22709,6 @@
       <w:pPr>
         <w:pStyle w:val="a7"/>
         <w:ind w:firstLine="0"/>
-        <w:rPr>
-          <w:color w:val="000000" w:themeColor="text1"/>
-        </w:rPr>
       </w:pPr>
     </w:p>
     <w:p>
@@ -21476,7 +22726,7 @@
         <w:rPr>
           <w:color w:val="000000" w:themeColor="text1"/>
         </w:rPr>
-        <w:t>Получение списка всех закрытых сделок</w:t>
+        <w:t>Получение списка всех активных сделок</w:t>
       </w:r>
     </w:p>
     <w:p>
@@ -21509,18 +22759,18 @@
               <w:rPr>
                 <w:rFonts w:ascii="Cascadia Mono" w:hAnsi="Cascadia Mono" w:cs="Cascadia Mono"/>
                 <w:color w:val="000000" w:themeColor="text1"/>
-                <w:sz w:val="20"/>
-                <w:szCs w:val="20"/>
+                <w:sz w:val="22"/>
+                <w:szCs w:val="22"/>
               </w:rPr>
             </w:pPr>
             <w:r>
               <w:rPr>
                 <w:rFonts w:ascii="Cascadia Mono" w:hAnsi="Cascadia Mono" w:cs="Cascadia Mono"/>
                 <w:color w:val="000000" w:themeColor="text1"/>
-                <w:sz w:val="20"/>
-                <w:szCs w:val="20"/>
-              </w:rPr>
-              <w:t xml:space="preserve">SELECT </w:t>
+                <w:sz w:val="22"/>
+                <w:szCs w:val="22"/>
+              </w:rPr>
+              <w:t xml:space="preserve">SELECT * </w:t>
             </w:r>
           </w:p>
           <w:p>
@@ -21529,236 +22779,36 @@
               <w:rPr>
                 <w:rFonts w:ascii="Cascadia Mono" w:hAnsi="Cascadia Mono" w:cs="Cascadia Mono"/>
                 <w:color w:val="000000" w:themeColor="text1"/>
-                <w:sz w:val="20"/>
-                <w:szCs w:val="20"/>
+                <w:sz w:val="22"/>
+                <w:szCs w:val="22"/>
               </w:rPr>
             </w:pPr>
             <w:r>
               <w:rPr>
                 <w:rFonts w:ascii="Cascadia Mono" w:hAnsi="Cascadia Mono" w:cs="Cascadia Mono"/>
                 <w:color w:val="000000" w:themeColor="text1"/>
-                <w:sz w:val="20"/>
-                <w:szCs w:val="20"/>
-              </w:rPr>
-              <w:t xml:space="preserve">    Сделка.[Код сделки], </w:t>
-            </w:r>
-          </w:p>
-          <w:p>
-            <w:pPr>
-              <w:ind w:firstLine="0"/>
+                <w:sz w:val="22"/>
+                <w:szCs w:val="22"/>
+              </w:rPr>
+              <w:t>FROM [Вывод всего]</w:t>
+            </w:r>
+          </w:p>
+          <w:p>
+            <w:pPr>
+              <w:pStyle w:val="a7"/>
+              <w:ind w:left="0" w:firstLine="0"/>
+              <w:rPr>
+                <w:color w:val="000000" w:themeColor="text1"/>
+              </w:rPr>
+            </w:pPr>
+            <w:r>
               <w:rPr>
                 <w:rFonts w:ascii="Cascadia Mono" w:hAnsi="Cascadia Mono" w:cs="Cascadia Mono"/>
                 <w:color w:val="000000" w:themeColor="text1"/>
-                <w:sz w:val="20"/>
-                <w:szCs w:val="20"/>
-              </w:rPr>
-            </w:pPr>
-            <w:r>
-              <w:rPr>
-                <w:rFonts w:ascii="Cascadia Mono" w:hAnsi="Cascadia Mono" w:cs="Cascadia Mono"/>
-                <w:color w:val="000000" w:themeColor="text1"/>
-                <w:sz w:val="20"/>
-                <w:szCs w:val="20"/>
-              </w:rPr>
-              <w:t xml:space="preserve">    Сделка.[Стоимость], </w:t>
-            </w:r>
-          </w:p>
-          <w:p>
-            <w:pPr>
-              <w:ind w:firstLine="0"/>
-              <w:rPr>
-                <w:rFonts w:ascii="Cascadia Mono" w:hAnsi="Cascadia Mono" w:cs="Cascadia Mono"/>
-                <w:color w:val="000000" w:themeColor="text1"/>
-                <w:sz w:val="20"/>
-                <w:szCs w:val="20"/>
-              </w:rPr>
-            </w:pPr>
-            <w:r>
-              <w:rPr>
-                <w:rFonts w:ascii="Cascadia Mono" w:hAnsi="Cascadia Mono" w:cs="Cascadia Mono"/>
-                <w:color w:val="000000" w:themeColor="text1"/>
-                <w:sz w:val="20"/>
-                <w:szCs w:val="20"/>
-              </w:rPr>
-              <w:t xml:space="preserve">    Владелец.[Фамилия], </w:t>
-            </w:r>
-          </w:p>
-          <w:p>
-            <w:pPr>
-              <w:ind w:firstLine="0"/>
-              <w:rPr>
-                <w:rFonts w:ascii="Cascadia Mono" w:hAnsi="Cascadia Mono" w:cs="Cascadia Mono"/>
-                <w:color w:val="000000" w:themeColor="text1"/>
-                <w:sz w:val="20"/>
-                <w:szCs w:val="20"/>
-              </w:rPr>
-            </w:pPr>
-            <w:r>
-              <w:rPr>
-                <w:rFonts w:ascii="Cascadia Mono" w:hAnsi="Cascadia Mono" w:cs="Cascadia Mono"/>
-                <w:color w:val="000000" w:themeColor="text1"/>
-                <w:sz w:val="20"/>
-                <w:szCs w:val="20"/>
-              </w:rPr>
-              <w:t xml:space="preserve">    Покупатель.[Фамилия], </w:t>
-            </w:r>
-          </w:p>
-          <w:p>
-            <w:pPr>
-              <w:ind w:firstLine="0"/>
-              <w:rPr>
-                <w:rFonts w:ascii="Cascadia Mono" w:hAnsi="Cascadia Mono" w:cs="Cascadia Mono"/>
-                <w:color w:val="000000" w:themeColor="text1"/>
-                <w:sz w:val="20"/>
-                <w:szCs w:val="20"/>
-              </w:rPr>
-            </w:pPr>
-            <w:r>
-              <w:rPr>
-                <w:rFonts w:ascii="Cascadia Mono" w:hAnsi="Cascadia Mono" w:cs="Cascadia Mono"/>
-                <w:color w:val="000000" w:themeColor="text1"/>
-                <w:sz w:val="20"/>
-                <w:szCs w:val="20"/>
-              </w:rPr>
-              <w:t xml:space="preserve">    Риэлтор.[Фамилия], </w:t>
-            </w:r>
-          </w:p>
-          <w:p>
-            <w:pPr>
-              <w:ind w:firstLine="0"/>
-              <w:rPr>
-                <w:rFonts w:ascii="Cascadia Mono" w:hAnsi="Cascadia Mono" w:cs="Cascadia Mono"/>
-                <w:color w:val="000000" w:themeColor="text1"/>
-                <w:sz w:val="20"/>
-                <w:szCs w:val="20"/>
-              </w:rPr>
-            </w:pPr>
-            <w:r>
-              <w:rPr>
-                <w:rFonts w:ascii="Cascadia Mono" w:hAnsi="Cascadia Mono" w:cs="Cascadia Mono"/>
-                <w:color w:val="000000" w:themeColor="text1"/>
-                <w:sz w:val="20"/>
-                <w:szCs w:val="20"/>
-              </w:rPr>
-              <w:t xml:space="preserve">    Предложение.*</w:t>
-            </w:r>
-          </w:p>
-          <w:p>
-            <w:pPr>
-              <w:ind w:firstLine="0"/>
-              <w:rPr>
-                <w:rFonts w:ascii="Cascadia Mono" w:hAnsi="Cascadia Mono" w:cs="Cascadia Mono"/>
-                <w:color w:val="000000" w:themeColor="text1"/>
-                <w:sz w:val="20"/>
-                <w:szCs w:val="20"/>
-              </w:rPr>
-            </w:pPr>
-            <w:r>
-              <w:rPr>
-                <w:rFonts w:ascii="Cascadia Mono" w:hAnsi="Cascadia Mono" w:cs="Cascadia Mono"/>
-                <w:color w:val="000000" w:themeColor="text1"/>
-                <w:sz w:val="20"/>
-                <w:szCs w:val="20"/>
-              </w:rPr>
-              <w:t xml:space="preserve">FROM (((Сделка </w:t>
-            </w:r>
-          </w:p>
-          <w:p>
-            <w:pPr>
-              <w:ind w:firstLine="0"/>
-              <w:rPr>
-                <w:rFonts w:ascii="Cascadia Mono" w:hAnsi="Cascadia Mono" w:cs="Cascadia Mono"/>
-                <w:color w:val="000000" w:themeColor="text1"/>
-                <w:sz w:val="20"/>
-                <w:szCs w:val="20"/>
-              </w:rPr>
-            </w:pPr>
-            <w:r>
-              <w:rPr>
-                <w:rFonts w:ascii="Cascadia Mono" w:hAnsi="Cascadia Mono" w:cs="Cascadia Mono"/>
-                <w:color w:val="000000" w:themeColor="text1"/>
-                <w:sz w:val="20"/>
-                <w:szCs w:val="20"/>
-              </w:rPr>
-              <w:t xml:space="preserve">INNER JOIN Риэлтор ON Сделка.[Код риэлтора] = Риэлтор.[Код риэлтора]) </w:t>
-            </w:r>
-          </w:p>
-          <w:p>
-            <w:pPr>
-              <w:ind w:firstLine="0"/>
-              <w:rPr>
-                <w:rFonts w:ascii="Cascadia Mono" w:hAnsi="Cascadia Mono" w:cs="Cascadia Mono"/>
-                <w:color w:val="000000" w:themeColor="text1"/>
-                <w:sz w:val="20"/>
-                <w:szCs w:val="20"/>
-              </w:rPr>
-            </w:pPr>
-            <w:r>
-              <w:rPr>
-                <w:rFonts w:ascii="Cascadia Mono" w:hAnsi="Cascadia Mono" w:cs="Cascadia Mono"/>
-                <w:color w:val="000000" w:themeColor="text1"/>
-                <w:sz w:val="20"/>
-                <w:szCs w:val="20"/>
-              </w:rPr>
-              <w:t xml:space="preserve">INNER JOIN Владелец ON Сделка.[Код владельца] = Владелец.[Код владельца]) </w:t>
-            </w:r>
-          </w:p>
-          <w:p>
-            <w:pPr>
-              <w:ind w:firstLine="0"/>
-              <w:rPr>
-                <w:rFonts w:ascii="Cascadia Mono" w:hAnsi="Cascadia Mono" w:cs="Cascadia Mono"/>
-                <w:color w:val="000000" w:themeColor="text1"/>
-                <w:sz w:val="20"/>
-                <w:szCs w:val="20"/>
-              </w:rPr>
-            </w:pPr>
-            <w:r>
-              <w:rPr>
-                <w:rFonts w:ascii="Cascadia Mono" w:hAnsi="Cascadia Mono" w:cs="Cascadia Mono"/>
-                <w:color w:val="000000" w:themeColor="text1"/>
-                <w:sz w:val="20"/>
-                <w:szCs w:val="20"/>
-              </w:rPr>
-              <w:t xml:space="preserve">INNER JOIN Покупатель ON Сделка.[Код покупателя] = Покупатель.[Код покупателя]) </w:t>
-            </w:r>
-          </w:p>
-          <w:p>
-            <w:pPr>
-              <w:ind w:firstLine="0"/>
-              <w:rPr>
-                <w:rFonts w:ascii="Cascadia Mono" w:hAnsi="Cascadia Mono" w:cs="Cascadia Mono"/>
-                <w:color w:val="000000" w:themeColor="text1"/>
-                <w:sz w:val="20"/>
-                <w:szCs w:val="20"/>
-              </w:rPr>
-            </w:pPr>
-            <w:r>
-              <w:rPr>
-                <w:rFonts w:ascii="Cascadia Mono" w:hAnsi="Cascadia Mono" w:cs="Cascadia Mono"/>
-                <w:color w:val="000000" w:themeColor="text1"/>
-                <w:sz w:val="20"/>
-                <w:szCs w:val="20"/>
-              </w:rPr>
-              <w:t>INNER JOIN Предложение ON Сделка.[Номер предложения] = Предложение.[Номер предложения]</w:t>
-            </w:r>
-          </w:p>
-          <w:p>
-            <w:pPr>
-              <w:pStyle w:val="a7"/>
-              <w:ind w:left="0" w:firstLine="0"/>
-              <w:rPr>
-                <w:color w:val="000000" w:themeColor="text1"/>
-              </w:rPr>
-            </w:pPr>
-            <w:r>
-              <w:rPr>
-                <w:rFonts w:ascii="Cascadia Mono" w:hAnsi="Cascadia Mono" w:cs="Cascadia Mono"/>
-                <w:color w:val="000000" w:themeColor="text1"/>
-                <w:sz w:val="20"/>
-                <w:szCs w:val="20"/>
-              </w:rPr>
-              <w:t>WHERE (((Сделка.[Код статуса сделки])=2));</w:t>
+                <w:sz w:val="22"/>
+                <w:szCs w:val="22"/>
+              </w:rPr>
+              <w:t>WHERE [Статус сделки]="Открыта";</w:t>
             </w:r>
           </w:p>
         </w:tc>
@@ -21788,13 +22838,7 @@
         <w:rPr>
           <w:color w:val="000000" w:themeColor="text1"/>
         </w:rPr>
-        <w:t xml:space="preserve">Получение списка активных сделок с сортировкой по </w:t>
-      </w:r>
-      <w:r>
-        <w:rPr>
-          <w:color w:val="000000" w:themeColor="text1"/>
-        </w:rPr>
-        <w:t>стоимости</w:t>
+        <w:t>Получение списка всех закрытых сделок</w:t>
       </w:r>
     </w:p>
     <w:p>
@@ -21838,7 +22882,7 @@
                 <w:sz w:val="22"/>
                 <w:szCs w:val="22"/>
               </w:rPr>
-              <w:t xml:space="preserve">SELECT </w:t>
+              <w:t xml:space="preserve">SELECT * </w:t>
             </w:r>
           </w:p>
           <w:p>
@@ -21858,19 +22902,26 @@
                 <w:sz w:val="22"/>
                 <w:szCs w:val="22"/>
               </w:rPr>
-              <w:t xml:space="preserve">    Сделка.[Код сделки], </w:t>
-            </w:r>
-          </w:p>
-          <w:p>
-            <w:pPr>
-              <w:ind w:firstLine="0"/>
+              <w:t>FROM [Вывод всего]</w:t>
+            </w:r>
+          </w:p>
+          <w:p>
+            <w:pPr>
+              <w:pStyle w:val="a7"/>
+              <w:ind w:left="0" w:firstLine="0"/>
+              <w:rPr>
+                <w:color w:val="000000" w:themeColor="text1"/>
+              </w:rPr>
+            </w:pPr>
+            <w:r>
               <w:rPr>
                 <w:rFonts w:ascii="Cascadia Mono" w:hAnsi="Cascadia Mono" w:cs="Cascadia Mono"/>
                 <w:color w:val="000000" w:themeColor="text1"/>
                 <w:sz w:val="22"/>
                 <w:szCs w:val="22"/>
               </w:rPr>
-            </w:pPr>
+              <w:t>WHERE [Статус сделки]="</w:t>
+            </w:r>
             <w:r>
               <w:rPr>
                 <w:rFonts w:ascii="Cascadia Mono" w:hAnsi="Cascadia Mono" w:cs="Cascadia Mono"/>
@@ -21878,196 +22929,16 @@
                 <w:sz w:val="22"/>
                 <w:szCs w:val="22"/>
               </w:rPr>
-              <w:t xml:space="preserve">    Сделка.[Стоимость], </w:t>
-            </w:r>
-          </w:p>
-          <w:p>
-            <w:pPr>
-              <w:ind w:firstLine="0"/>
+              <w:t>Завершена</w:t>
+            </w:r>
+            <w:r>
               <w:rPr>
                 <w:rFonts w:ascii="Cascadia Mono" w:hAnsi="Cascadia Mono" w:cs="Cascadia Mono"/>
                 <w:color w:val="000000" w:themeColor="text1"/>
                 <w:sz w:val="22"/>
                 <w:szCs w:val="22"/>
               </w:rPr>
-            </w:pPr>
-            <w:r>
-              <w:rPr>
-                <w:rFonts w:ascii="Cascadia Mono" w:hAnsi="Cascadia Mono" w:cs="Cascadia Mono"/>
-                <w:color w:val="000000" w:themeColor="text1"/>
-                <w:sz w:val="22"/>
-                <w:szCs w:val="22"/>
-              </w:rPr>
-              <w:t xml:space="preserve">    Владелец.[Фамилия],</w:t>
-            </w:r>
-          </w:p>
-          <w:p>
-            <w:pPr>
-              <w:ind w:firstLine="0"/>
-              <w:rPr>
-                <w:rFonts w:ascii="Cascadia Mono" w:hAnsi="Cascadia Mono" w:cs="Cascadia Mono"/>
-                <w:color w:val="000000" w:themeColor="text1"/>
-                <w:sz w:val="22"/>
-                <w:szCs w:val="22"/>
-              </w:rPr>
-            </w:pPr>
-            <w:r>
-              <w:rPr>
-                <w:rFonts w:ascii="Cascadia Mono" w:hAnsi="Cascadia Mono" w:cs="Cascadia Mono"/>
-                <w:color w:val="000000" w:themeColor="text1"/>
-                <w:sz w:val="22"/>
-                <w:szCs w:val="22"/>
-              </w:rPr>
-              <w:t xml:space="preserve">    Риэлтор.[Фамилия],</w:t>
-            </w:r>
-          </w:p>
-          <w:p>
-            <w:pPr>
-              <w:ind w:firstLine="0"/>
-              <w:rPr>
-                <w:rFonts w:ascii="Cascadia Mono" w:hAnsi="Cascadia Mono" w:cs="Cascadia Mono"/>
-                <w:color w:val="000000" w:themeColor="text1"/>
-                <w:sz w:val="22"/>
-                <w:szCs w:val="22"/>
-              </w:rPr>
-            </w:pPr>
-            <w:r>
-              <w:rPr>
-                <w:rFonts w:ascii="Cascadia Mono" w:hAnsi="Cascadia Mono" w:cs="Cascadia Mono"/>
-                <w:color w:val="000000" w:themeColor="text1"/>
-                <w:sz w:val="22"/>
-                <w:szCs w:val="22"/>
-              </w:rPr>
-              <w:t xml:space="preserve">    Предложение.*</w:t>
-            </w:r>
-          </w:p>
-          <w:p>
-            <w:pPr>
-              <w:ind w:firstLine="0"/>
-              <w:rPr>
-                <w:rFonts w:ascii="Cascadia Mono" w:hAnsi="Cascadia Mono" w:cs="Cascadia Mono"/>
-                <w:color w:val="000000" w:themeColor="text1"/>
-                <w:sz w:val="22"/>
-                <w:szCs w:val="22"/>
-              </w:rPr>
-            </w:pPr>
-            <w:r>
-              <w:rPr>
-                <w:rFonts w:ascii="Cascadia Mono" w:hAnsi="Cascadia Mono" w:cs="Cascadia Mono"/>
-                <w:color w:val="000000" w:themeColor="text1"/>
-                <w:sz w:val="22"/>
-                <w:szCs w:val="22"/>
-              </w:rPr>
-              <w:t>FROM (((Сделка</w:t>
-            </w:r>
-          </w:p>
-          <w:p>
-            <w:pPr>
-              <w:ind w:firstLine="0"/>
-              <w:rPr>
-                <w:rFonts w:ascii="Cascadia Mono" w:hAnsi="Cascadia Mono" w:cs="Cascadia Mono"/>
-                <w:color w:val="000000" w:themeColor="text1"/>
-                <w:sz w:val="22"/>
-                <w:szCs w:val="22"/>
-              </w:rPr>
-            </w:pPr>
-            <w:r>
-              <w:rPr>
-                <w:rFonts w:ascii="Cascadia Mono" w:hAnsi="Cascadia Mono" w:cs="Cascadia Mono"/>
-                <w:color w:val="000000" w:themeColor="text1"/>
-                <w:sz w:val="22"/>
-                <w:szCs w:val="22"/>
-              </w:rPr>
-              <w:t>INNER JOIN Риэлтор ON Сделка.[Код риэлтора] = Риэлтор.[Код риэлтора])</w:t>
-            </w:r>
-          </w:p>
-          <w:p>
-            <w:pPr>
-              <w:ind w:firstLine="0"/>
-              <w:rPr>
-                <w:rFonts w:ascii="Cascadia Mono" w:hAnsi="Cascadia Mono" w:cs="Cascadia Mono"/>
-                <w:color w:val="000000" w:themeColor="text1"/>
-                <w:sz w:val="22"/>
-                <w:szCs w:val="22"/>
-              </w:rPr>
-            </w:pPr>
-            <w:r>
-              <w:rPr>
-                <w:rFonts w:ascii="Cascadia Mono" w:hAnsi="Cascadia Mono" w:cs="Cascadia Mono"/>
-                <w:color w:val="000000" w:themeColor="text1"/>
-                <w:sz w:val="22"/>
-                <w:szCs w:val="22"/>
-              </w:rPr>
-              <w:t>INNER JOIN Владелец ON Сделка.[Код владельца] = Владелец.[Код владельца])</w:t>
-            </w:r>
-          </w:p>
-          <w:p>
-            <w:pPr>
-              <w:ind w:firstLine="0"/>
-              <w:rPr>
-                <w:rFonts w:ascii="Cascadia Mono" w:hAnsi="Cascadia Mono" w:cs="Cascadia Mono"/>
-                <w:color w:val="000000" w:themeColor="text1"/>
-                <w:sz w:val="22"/>
-                <w:szCs w:val="22"/>
-              </w:rPr>
-            </w:pPr>
-            <w:r>
-              <w:rPr>
-                <w:rFonts w:ascii="Cascadia Mono" w:hAnsi="Cascadia Mono" w:cs="Cascadia Mono"/>
-                <w:color w:val="000000" w:themeColor="text1"/>
-                <w:sz w:val="22"/>
-                <w:szCs w:val="22"/>
-              </w:rPr>
-              <w:t>INNER JOIN Предложение ON Сделка.[Номер предложения] = Предложение.[Номер предложения])</w:t>
-            </w:r>
-          </w:p>
-          <w:p>
-            <w:pPr>
-              <w:pStyle w:val="a7"/>
-              <w:ind w:left="0" w:firstLine="0"/>
-              <w:rPr>
-                <w:rFonts w:ascii="Cascadia Mono" w:hAnsi="Cascadia Mono" w:cs="Cascadia Mono"/>
-                <w:color w:val="000000" w:themeColor="text1"/>
-                <w:sz w:val="22"/>
-                <w:szCs w:val="22"/>
-              </w:rPr>
-            </w:pPr>
-            <w:r>
-              <w:rPr>
-                <w:rFonts w:ascii="Cascadia Mono" w:hAnsi="Cascadia Mono" w:cs="Cascadia Mono"/>
-                <w:color w:val="000000" w:themeColor="text1"/>
-                <w:sz w:val="22"/>
-                <w:szCs w:val="22"/>
-              </w:rPr>
-              <w:t>WHERE (((Сделка.[Код статуса сделки])=1))</w:t>
-            </w:r>
-          </w:p>
-          <w:p>
-            <w:pPr>
-              <w:pStyle w:val="a7"/>
-              <w:ind w:left="0" w:firstLine="0"/>
-              <w:rPr>
-                <w:color w:val="000000" w:themeColor="text1"/>
-              </w:rPr>
-            </w:pPr>
-            <w:r>
-              <w:rPr>
-                <w:rFonts w:ascii="Cascadia Mono" w:hAnsi="Cascadia Mono" w:cs="Cascadia Mono"/>
-                <w:color w:val="000000" w:themeColor="text1"/>
-                <w:sz w:val="22"/>
-                <w:szCs w:val="22"/>
-                <w:lang w:val="en-US"/>
-              </w:rPr>
-              <w:t xml:space="preserve">ORDER BY </w:t>
-            </w:r>
-            <w:r>
-              <w:rPr>
-                <w:rFonts w:ascii="Cascadia Mono" w:hAnsi="Cascadia Mono" w:cs="Cascadia Mono"/>
-                <w:color w:val="000000" w:themeColor="text1"/>
-                <w:sz w:val="22"/>
-                <w:szCs w:val="22"/>
-              </w:rPr>
-              <w:t>Сделка.[Стоимость];</w:t>
+              <w:t>";</w:t>
             </w:r>
           </w:p>
         </w:tc>
@@ -22097,8 +22968,13 @@
         <w:rPr>
           <w:color w:val="000000" w:themeColor="text1"/>
         </w:rPr>
-        <w:lastRenderedPageBreak/>
-        <w:t>Получение списка активных сделок с сортировкой дате поступления</w:t>
+        <w:t xml:space="preserve">Получение списка активных сделок с сортировкой по </w:t>
+      </w:r>
+      <w:r>
+        <w:rPr>
+          <w:color w:val="000000" w:themeColor="text1"/>
+        </w:rPr>
+        <w:t>стоимости</w:t>
       </w:r>
     </w:p>
     <w:p>
@@ -22127,12 +23003,97 @@
           </w:tcPr>
           <w:p>
             <w:pPr>
+              <w:ind w:firstLine="0"/>
+              <w:rPr>
+                <w:rFonts w:ascii="Cascadia Mono" w:hAnsi="Cascadia Mono" w:cs="Cascadia Mono"/>
+                <w:color w:val="000000" w:themeColor="text1"/>
+                <w:sz w:val="20"/>
+                <w:szCs w:val="20"/>
+              </w:rPr>
+            </w:pPr>
+            <w:r>
+              <w:rPr>
+                <w:rFonts w:ascii="Cascadia Mono" w:hAnsi="Cascadia Mono" w:cs="Cascadia Mono"/>
+                <w:color w:val="000000" w:themeColor="text1"/>
+                <w:sz w:val="20"/>
+                <w:szCs w:val="20"/>
+              </w:rPr>
+              <w:t>SELECT *</w:t>
+            </w:r>
+          </w:p>
+          <w:p>
+            <w:pPr>
+              <w:ind w:firstLine="0"/>
+              <w:rPr>
+                <w:rFonts w:ascii="Cascadia Mono" w:hAnsi="Cascadia Mono" w:cs="Cascadia Mono"/>
+                <w:color w:val="000000" w:themeColor="text1"/>
+                <w:sz w:val="20"/>
+                <w:szCs w:val="20"/>
+              </w:rPr>
+            </w:pPr>
+            <w:r>
+              <w:rPr>
+                <w:rFonts w:ascii="Cascadia Mono" w:hAnsi="Cascadia Mono" w:cs="Cascadia Mono"/>
+                <w:color w:val="000000" w:themeColor="text1"/>
+                <w:sz w:val="20"/>
+                <w:szCs w:val="20"/>
+              </w:rPr>
+              <w:t>FROM [</w:t>
+            </w:r>
+            <w:r>
+              <w:rPr>
+                <w:rFonts w:ascii="Cascadia Mono" w:hAnsi="Cascadia Mono" w:cs="Cascadia Mono"/>
+                <w:color w:val="000000" w:themeColor="text1"/>
+                <w:sz w:val="20"/>
+                <w:szCs w:val="20"/>
+              </w:rPr>
+              <w:t>Активные сделки</w:t>
+            </w:r>
+            <w:r>
+              <w:rPr>
+                <w:rFonts w:ascii="Cascadia Mono" w:hAnsi="Cascadia Mono" w:cs="Cascadia Mono"/>
+                <w:color w:val="000000" w:themeColor="text1"/>
+                <w:sz w:val="20"/>
+                <w:szCs w:val="20"/>
+              </w:rPr>
+              <w:t>]</w:t>
+            </w:r>
+          </w:p>
+          <w:p>
+            <w:pPr>
               <w:pStyle w:val="a7"/>
               <w:ind w:left="0" w:firstLine="0"/>
               <w:rPr>
                 <w:color w:val="000000" w:themeColor="text1"/>
               </w:rPr>
             </w:pPr>
+            <w:r>
+              <w:rPr>
+                <w:rFonts w:ascii="Cascadia Mono" w:hAnsi="Cascadia Mono" w:cs="Cascadia Mono"/>
+                <w:color w:val="000000" w:themeColor="text1"/>
+                <w:sz w:val="20"/>
+                <w:szCs w:val="20"/>
+              </w:rPr>
+              <w:t>ORDER BY [</w:t>
+            </w:r>
+            <w:r>
+              <w:rPr>
+                <w:rFonts w:ascii="Cascadia Mono" w:hAnsi="Cascadia Mono" w:cs="Cascadia Mono"/>
+                <w:color w:val="000000" w:themeColor="text1"/>
+                <w:sz w:val="20"/>
+                <w:szCs w:val="20"/>
+              </w:rPr>
+              <w:t>Стоимость</w:t>
+            </w:r>
+            <w:r>
+              <w:rPr>
+                <w:rFonts w:ascii="Cascadia Mono" w:hAnsi="Cascadia Mono" w:cs="Cascadia Mono"/>
+                <w:color w:val="000000" w:themeColor="text1"/>
+                <w:sz w:val="20"/>
+                <w:szCs w:val="20"/>
+              </w:rPr>
+              <w:t>];</w:t>
+            </w:r>
           </w:p>
         </w:tc>
       </w:tr>
@@ -22153,15 +23114,24 @@
           <w:ilvl w:val="0"/>
           <w:numId w:val="10"/>
         </w:numPr>
-      </w:pPr>
-      <w:r>
-        <w:t>Получение списка просроченных договоров</w:t>
+        <w:rPr>
+          <w:color w:val="000000" w:themeColor="text1"/>
+        </w:rPr>
+      </w:pPr>
+      <w:r>
+        <w:rPr>
+          <w:color w:val="000000" w:themeColor="text1"/>
+        </w:rPr>
+        <w:t>Получение списка активных сделок с сортировкой дате поступления</w:t>
       </w:r>
     </w:p>
     <w:p>
       <w:pPr>
         <w:pStyle w:val="a7"/>
         <w:ind w:firstLine="0"/>
+        <w:rPr>
+          <w:color w:val="000000" w:themeColor="text1"/>
+        </w:rPr>
       </w:pPr>
     </w:p>
     <w:tbl>
@@ -22181,9 +23151,79 @@
           </w:tcPr>
           <w:p>
             <w:pPr>
+              <w:ind w:firstLine="0"/>
+              <w:rPr>
+                <w:rFonts w:ascii="Cascadia Mono" w:hAnsi="Cascadia Mono" w:cs="Cascadia Mono"/>
+                <w:color w:val="000000" w:themeColor="text1"/>
+                <w:sz w:val="20"/>
+                <w:szCs w:val="20"/>
+              </w:rPr>
+            </w:pPr>
+            <w:r>
+              <w:rPr>
+                <w:rFonts w:ascii="Cascadia Mono" w:hAnsi="Cascadia Mono" w:cs="Cascadia Mono"/>
+                <w:color w:val="000000" w:themeColor="text1"/>
+                <w:sz w:val="20"/>
+                <w:szCs w:val="20"/>
+              </w:rPr>
+              <w:t>SELECT *</w:t>
+            </w:r>
+          </w:p>
+          <w:p>
+            <w:pPr>
+              <w:ind w:firstLine="0"/>
+              <w:rPr>
+                <w:rFonts w:ascii="Cascadia Mono" w:hAnsi="Cascadia Mono" w:cs="Cascadia Mono"/>
+                <w:color w:val="000000" w:themeColor="text1"/>
+                <w:sz w:val="20"/>
+                <w:szCs w:val="20"/>
+              </w:rPr>
+            </w:pPr>
+            <w:r>
+              <w:rPr>
+                <w:rFonts w:ascii="Cascadia Mono" w:hAnsi="Cascadia Mono" w:cs="Cascadia Mono"/>
+                <w:color w:val="000000" w:themeColor="text1"/>
+                <w:sz w:val="20"/>
+                <w:szCs w:val="20"/>
+              </w:rPr>
+              <w:t>FROM [</w:t>
+            </w:r>
+            <w:r>
+              <w:rPr>
+                <w:rFonts w:ascii="Cascadia Mono" w:hAnsi="Cascadia Mono" w:cs="Cascadia Mono"/>
+                <w:color w:val="000000" w:themeColor="text1"/>
+                <w:sz w:val="20"/>
+                <w:szCs w:val="20"/>
+              </w:rPr>
+              <w:t>Активные сделки</w:t>
+            </w:r>
+            <w:r>
+              <w:rPr>
+                <w:rFonts w:ascii="Cascadia Mono" w:hAnsi="Cascadia Mono" w:cs="Cascadia Mono"/>
+                <w:color w:val="000000" w:themeColor="text1"/>
+                <w:sz w:val="20"/>
+                <w:szCs w:val="20"/>
+              </w:rPr>
+              <w:t>]</w:t>
+            </w:r>
+          </w:p>
+          <w:p>
+            <w:pPr>
               <w:pStyle w:val="a7"/>
               <w:ind w:left="0" w:firstLine="0"/>
-            </w:pPr>
+              <w:rPr>
+                <w:color w:val="000000" w:themeColor="text1"/>
+              </w:rPr>
+            </w:pPr>
+            <w:r>
+              <w:rPr>
+                <w:rFonts w:ascii="Cascadia Mono" w:hAnsi="Cascadia Mono" w:cs="Cascadia Mono"/>
+                <w:color w:val="000000" w:themeColor="text1"/>
+                <w:sz w:val="20"/>
+                <w:szCs w:val="20"/>
+              </w:rPr>
+              <w:t>ORDER BY [Дата поступления];</w:t>
+            </w:r>
           </w:p>
         </w:tc>
       </w:tr>
@@ -22192,6 +23232,9 @@
       <w:pPr>
         <w:pStyle w:val="a7"/>
         <w:ind w:firstLine="0"/>
+        <w:rPr>
+          <w:color w:val="000000" w:themeColor="text1"/>
+        </w:rPr>
       </w:pPr>
     </w:p>
     <w:p>
@@ -22203,7 +23246,7 @@
         </w:numPr>
       </w:pPr>
       <w:r>
-        <w:t>Получение активных сделок в доме</w:t>
+        <w:t>Получение списка просроченных договоров</w:t>
       </w:r>
     </w:p>
     <w:p>
@@ -22251,7 +23294,7 @@
         </w:numPr>
       </w:pPr>
       <w:r>
-        <w:t>Получение активных сделок на улице</w:t>
+        <w:t>Получение активных сделок в доме</w:t>
       </w:r>
     </w:p>
     <w:p>
@@ -22299,7 +23342,7 @@
         </w:numPr>
       </w:pPr>
       <w:r>
-        <w:t>Получение активных сделок в микрорайоне</w:t>
+        <w:t>Получение активных сделок на улице</w:t>
       </w:r>
     </w:p>
     <w:p>
@@ -22347,10 +23390,10 @@
         </w:numPr>
       </w:pPr>
       <w:r>
-        <w:t xml:space="preserve"> </w:t>
-      </w:r>
-      <w:r>
-        <w:t>Получение активных сделок в районе с детским садом</w:t>
+        <w:t xml:space="preserve">Получение активных сделок в </w:t>
+      </w:r>
+      <w:r>
+        <w:t>квартале</w:t>
       </w:r>
     </w:p>
     <w:p>
@@ -22398,7 +23441,16 @@
         </w:numPr>
       </w:pPr>
       <w:r>
-        <w:t>Получение активных сделок в районе со школой</w:t>
+        <w:t xml:space="preserve"> </w:t>
+      </w:r>
+      <w:r>
+        <w:t xml:space="preserve">Получение активных сделок в </w:t>
+      </w:r>
+      <w:r>
+        <w:t>квартале</w:t>
+      </w:r>
+      <w:r>
+        <w:t xml:space="preserve"> с детским садом</w:t>
       </w:r>
     </w:p>
     <w:p>
@@ -22424,9 +23476,74 @@
           </w:tcPr>
           <w:p>
             <w:pPr>
+              <w:ind w:firstLine="0"/>
+              <w:rPr>
+                <w:rFonts w:ascii="Cascadia Mono" w:hAnsi="Cascadia Mono" w:cs="Cascadia Mono"/>
+                <w:sz w:val="20"/>
+                <w:szCs w:val="20"/>
+              </w:rPr>
+            </w:pPr>
+            <w:r>
+              <w:rPr>
+                <w:rFonts w:ascii="Cascadia Mono" w:hAnsi="Cascadia Mono" w:cs="Cascadia Mono"/>
+                <w:sz w:val="20"/>
+                <w:szCs w:val="20"/>
+              </w:rPr>
+              <w:t>SELECT *</w:t>
+            </w:r>
+          </w:p>
+          <w:p>
+            <w:pPr>
+              <w:ind w:firstLine="0"/>
+              <w:rPr>
+                <w:rFonts w:ascii="Cascadia Mono" w:hAnsi="Cascadia Mono" w:cs="Cascadia Mono"/>
+                <w:sz w:val="20"/>
+                <w:szCs w:val="20"/>
+              </w:rPr>
+            </w:pPr>
+            <w:r>
+              <w:rPr>
+                <w:rFonts w:ascii="Cascadia Mono" w:hAnsi="Cascadia Mono" w:cs="Cascadia Mono"/>
+                <w:sz w:val="20"/>
+                <w:szCs w:val="20"/>
+              </w:rPr>
+              <w:t>FROM [</w:t>
+            </w:r>
+            <w:r>
+              <w:rPr>
+                <w:rFonts w:ascii="Cascadia Mono" w:hAnsi="Cascadia Mono" w:cs="Cascadia Mono"/>
+                <w:sz w:val="20"/>
+                <w:szCs w:val="20"/>
+              </w:rPr>
+              <w:t>Активные сделки</w:t>
+            </w:r>
+            <w:r>
+              <w:rPr>
+                <w:rFonts w:ascii="Cascadia Mono" w:hAnsi="Cascadia Mono" w:cs="Cascadia Mono"/>
+                <w:sz w:val="20"/>
+                <w:szCs w:val="20"/>
+              </w:rPr>
+              <w:t>]</w:t>
+            </w:r>
+          </w:p>
+          <w:p>
+            <w:pPr>
               <w:pStyle w:val="a7"/>
               <w:ind w:left="0" w:firstLine="0"/>
-            </w:pPr>
+              <w:rPr>
+                <w:rFonts w:ascii="Cascadia Mono" w:hAnsi="Cascadia Mono" w:cs="Cascadia Mono"/>
+                <w:sz w:val="20"/>
+                <w:szCs w:val="20"/>
+              </w:rPr>
+            </w:pPr>
+            <w:r>
+              <w:rPr>
+                <w:rFonts w:ascii="Cascadia Mono" w:hAnsi="Cascadia Mono" w:cs="Cascadia Mono"/>
+                <w:sz w:val="20"/>
+                <w:szCs w:val="20"/>
+              </w:rPr>
+              <w:t>WHERE [Наличие детского сада]=True;</w:t>
+            </w:r>
           </w:p>
         </w:tc>
       </w:tr>
@@ -22446,7 +23563,7 @@
         </w:numPr>
       </w:pPr>
       <w:r>
-        <w:t>Получение активных сделок с разрешением на питомцев</w:t>
+        <w:t>Получение активных сделок в районе со школой</w:t>
       </w:r>
     </w:p>
     <w:p>
@@ -22472,9 +23589,85 @@
           </w:tcPr>
           <w:p>
             <w:pPr>
+              <w:ind w:firstLine="0"/>
+              <w:rPr>
+                <w:rFonts w:ascii="Cascadia Mono" w:hAnsi="Cascadia Mono" w:cs="Cascadia Mono"/>
+                <w:sz w:val="20"/>
+                <w:szCs w:val="20"/>
+              </w:rPr>
+            </w:pPr>
+            <w:r>
+              <w:rPr>
+                <w:rFonts w:ascii="Cascadia Mono" w:hAnsi="Cascadia Mono" w:cs="Cascadia Mono"/>
+                <w:sz w:val="20"/>
+                <w:szCs w:val="20"/>
+              </w:rPr>
+              <w:t>SELECT *</w:t>
+            </w:r>
+          </w:p>
+          <w:p>
+            <w:pPr>
+              <w:ind w:firstLine="0"/>
+              <w:rPr>
+                <w:rFonts w:ascii="Cascadia Mono" w:hAnsi="Cascadia Mono" w:cs="Cascadia Mono"/>
+                <w:sz w:val="20"/>
+                <w:szCs w:val="20"/>
+              </w:rPr>
+            </w:pPr>
+            <w:r>
+              <w:rPr>
+                <w:rFonts w:ascii="Cascadia Mono" w:hAnsi="Cascadia Mono" w:cs="Cascadia Mono"/>
+                <w:sz w:val="20"/>
+                <w:szCs w:val="20"/>
+              </w:rPr>
+              <w:t>FROM [</w:t>
+            </w:r>
+            <w:r>
+              <w:rPr>
+                <w:rFonts w:ascii="Cascadia Mono" w:hAnsi="Cascadia Mono" w:cs="Cascadia Mono"/>
+                <w:sz w:val="20"/>
+                <w:szCs w:val="20"/>
+              </w:rPr>
+              <w:t>Активные сделки</w:t>
+            </w:r>
+            <w:r>
+              <w:rPr>
+                <w:rFonts w:ascii="Cascadia Mono" w:hAnsi="Cascadia Mono" w:cs="Cascadia Mono"/>
+                <w:sz w:val="20"/>
+                <w:szCs w:val="20"/>
+              </w:rPr>
+              <w:t>]</w:t>
+            </w:r>
+          </w:p>
+          <w:p>
+            <w:pPr>
               <w:pStyle w:val="a7"/>
               <w:ind w:left="0" w:firstLine="0"/>
             </w:pPr>
+            <w:r>
+              <w:rPr>
+                <w:rFonts w:ascii="Cascadia Mono" w:hAnsi="Cascadia Mono" w:cs="Cascadia Mono"/>
+                <w:sz w:val="20"/>
+                <w:szCs w:val="20"/>
+              </w:rPr>
+              <w:t xml:space="preserve">WHERE AND [Наличие </w:t>
+            </w:r>
+            <w:r>
+              <w:rPr>
+                <w:rFonts w:ascii="Cascadia Mono" w:hAnsi="Cascadia Mono" w:cs="Cascadia Mono"/>
+                <w:sz w:val="20"/>
+                <w:szCs w:val="20"/>
+              </w:rPr>
+              <w:t>школы</w:t>
+            </w:r>
+            <w:r>
+              <w:rPr>
+                <w:rFonts w:ascii="Cascadia Mono" w:hAnsi="Cascadia Mono" w:cs="Cascadia Mono"/>
+                <w:sz w:val="20"/>
+                <w:szCs w:val="20"/>
+              </w:rPr>
+              <w:t>]=True;</w:t>
+            </w:r>
           </w:p>
         </w:tc>
       </w:tr>
@@ -22494,7 +23687,7 @@
         </w:numPr>
       </w:pPr>
       <w:r>
-        <w:t>Получение активных сделок с разрешением на иностранцев</w:t>
+        <w:t>Получение активных сделок с разрешением на питомцев</w:t>
       </w:r>
     </w:p>
     <w:p>
@@ -22520,9 +23713,53 @@
           </w:tcPr>
           <w:p>
             <w:pPr>
+              <w:ind w:firstLine="0"/>
+              <w:rPr>
+                <w:rFonts w:ascii="Cascadia Mono" w:hAnsi="Cascadia Mono" w:cs="Cascadia Mono"/>
+                <w:sz w:val="20"/>
+                <w:szCs w:val="20"/>
+              </w:rPr>
+            </w:pPr>
+            <w:r>
+              <w:rPr>
+                <w:rFonts w:ascii="Cascadia Mono" w:hAnsi="Cascadia Mono" w:cs="Cascadia Mono"/>
+                <w:sz w:val="20"/>
+                <w:szCs w:val="20"/>
+              </w:rPr>
+              <w:t>SELECT *</w:t>
+            </w:r>
+          </w:p>
+          <w:p>
+            <w:pPr>
+              <w:ind w:firstLine="0"/>
+              <w:rPr>
+                <w:rFonts w:ascii="Cascadia Mono" w:hAnsi="Cascadia Mono" w:cs="Cascadia Mono"/>
+                <w:sz w:val="20"/>
+                <w:szCs w:val="20"/>
+              </w:rPr>
+            </w:pPr>
+            <w:r>
+              <w:rPr>
+                <w:rFonts w:ascii="Cascadia Mono" w:hAnsi="Cascadia Mono" w:cs="Cascadia Mono"/>
+                <w:sz w:val="20"/>
+                <w:szCs w:val="20"/>
+              </w:rPr>
+              <w:t>FROM [Активные сделки]</w:t>
+            </w:r>
+          </w:p>
+          <w:p>
+            <w:pPr>
               <w:pStyle w:val="a7"/>
               <w:ind w:left="0" w:firstLine="0"/>
             </w:pPr>
+            <w:r>
+              <w:rPr>
+                <w:rFonts w:ascii="Cascadia Mono" w:hAnsi="Cascadia Mono" w:cs="Cascadia Mono"/>
+                <w:sz w:val="20"/>
+                <w:szCs w:val="20"/>
+              </w:rPr>
+              <w:t>WHERE [Разрешены питомцы]=True;</w:t>
+            </w:r>
           </w:p>
         </w:tc>
       </w:tr>
@@ -22542,7 +23779,7 @@
         </w:numPr>
       </w:pPr>
       <w:r>
-        <w:t>Получение активных сделок с разрешением на иногородних</w:t>
+        <w:t>Получение активных сделок с разрешением на иностранцев</w:t>
       </w:r>
     </w:p>
     <w:p>
@@ -22568,9 +23805,70 @@
           </w:tcPr>
           <w:p>
             <w:pPr>
+              <w:ind w:firstLine="0"/>
+              <w:rPr>
+                <w:rFonts w:ascii="Cascadia Mono" w:hAnsi="Cascadia Mono" w:cs="Cascadia Mono"/>
+                <w:sz w:val="20"/>
+                <w:szCs w:val="20"/>
+              </w:rPr>
+            </w:pPr>
+            <w:r>
+              <w:rPr>
+                <w:rFonts w:ascii="Cascadia Mono" w:hAnsi="Cascadia Mono" w:cs="Cascadia Mono"/>
+                <w:sz w:val="20"/>
+                <w:szCs w:val="20"/>
+              </w:rPr>
+              <w:t>SELECT *</w:t>
+            </w:r>
+          </w:p>
+          <w:p>
+            <w:pPr>
+              <w:ind w:firstLine="0"/>
+              <w:rPr>
+                <w:rFonts w:ascii="Cascadia Mono" w:hAnsi="Cascadia Mono" w:cs="Cascadia Mono"/>
+                <w:sz w:val="20"/>
+                <w:szCs w:val="20"/>
+              </w:rPr>
+            </w:pPr>
+            <w:r>
+              <w:rPr>
+                <w:rFonts w:ascii="Cascadia Mono" w:hAnsi="Cascadia Mono" w:cs="Cascadia Mono"/>
+                <w:sz w:val="20"/>
+                <w:szCs w:val="20"/>
+              </w:rPr>
+              <w:lastRenderedPageBreak/>
+              <w:t>FROM [Активные сделки]</w:t>
+            </w:r>
+          </w:p>
+          <w:p>
+            <w:pPr>
               <w:pStyle w:val="a7"/>
               <w:ind w:left="0" w:firstLine="0"/>
             </w:pPr>
+            <w:r>
+              <w:rPr>
+                <w:rFonts w:ascii="Cascadia Mono" w:hAnsi="Cascadia Mono" w:cs="Cascadia Mono"/>
+                <w:sz w:val="20"/>
+                <w:szCs w:val="20"/>
+              </w:rPr>
+              <w:t xml:space="preserve">WHERE [Разрешены </w:t>
+            </w:r>
+            <w:r>
+              <w:rPr>
+                <w:rFonts w:ascii="Cascadia Mono" w:hAnsi="Cascadia Mono" w:cs="Cascadia Mono"/>
+                <w:sz w:val="20"/>
+                <w:szCs w:val="20"/>
+              </w:rPr>
+              <w:t>иностранцы</w:t>
+            </w:r>
+            <w:r>
+              <w:rPr>
+                <w:rFonts w:ascii="Cascadia Mono" w:hAnsi="Cascadia Mono" w:cs="Cascadia Mono"/>
+                <w:sz w:val="20"/>
+                <w:szCs w:val="20"/>
+              </w:rPr>
+              <w:t>]=True;</w:t>
+            </w:r>
           </w:p>
         </w:tc>
       </w:tr>
@@ -22590,7 +23888,7 @@
         </w:numPr>
       </w:pPr>
       <w:r>
-        <w:t>Получение активных сделок с разрешением на курение</w:t>
+        <w:t>Получение активных сделок с разрешением на иногородних</w:t>
       </w:r>
     </w:p>
     <w:p>
@@ -22616,9 +23914,69 @@
           </w:tcPr>
           <w:p>
             <w:pPr>
+              <w:ind w:firstLine="0"/>
+              <w:rPr>
+                <w:rFonts w:ascii="Cascadia Mono" w:hAnsi="Cascadia Mono" w:cs="Cascadia Mono"/>
+                <w:sz w:val="20"/>
+                <w:szCs w:val="20"/>
+              </w:rPr>
+            </w:pPr>
+            <w:r>
+              <w:rPr>
+                <w:rFonts w:ascii="Cascadia Mono" w:hAnsi="Cascadia Mono" w:cs="Cascadia Mono"/>
+                <w:sz w:val="20"/>
+                <w:szCs w:val="20"/>
+              </w:rPr>
+              <w:t>SELECT *</w:t>
+            </w:r>
+          </w:p>
+          <w:p>
+            <w:pPr>
+              <w:ind w:firstLine="0"/>
+              <w:rPr>
+                <w:rFonts w:ascii="Cascadia Mono" w:hAnsi="Cascadia Mono" w:cs="Cascadia Mono"/>
+                <w:sz w:val="20"/>
+                <w:szCs w:val="20"/>
+              </w:rPr>
+            </w:pPr>
+            <w:r>
+              <w:rPr>
+                <w:rFonts w:ascii="Cascadia Mono" w:hAnsi="Cascadia Mono" w:cs="Cascadia Mono"/>
+                <w:sz w:val="20"/>
+                <w:szCs w:val="20"/>
+              </w:rPr>
+              <w:t>FROM [Активные сделки]</w:t>
+            </w:r>
+          </w:p>
+          <w:p>
+            <w:pPr>
               <w:pStyle w:val="a7"/>
               <w:ind w:left="0" w:firstLine="0"/>
             </w:pPr>
+            <w:r>
+              <w:rPr>
+                <w:rFonts w:ascii="Cascadia Mono" w:hAnsi="Cascadia Mono" w:cs="Cascadia Mono"/>
+                <w:sz w:val="20"/>
+                <w:szCs w:val="20"/>
+              </w:rPr>
+              <w:t xml:space="preserve">WHERE [Разрешены </w:t>
+            </w:r>
+            <w:r>
+              <w:rPr>
+                <w:rFonts w:ascii="Cascadia Mono" w:hAnsi="Cascadia Mono" w:cs="Cascadia Mono"/>
+                <w:sz w:val="20"/>
+                <w:szCs w:val="20"/>
+              </w:rPr>
+              <w:t>иногородние</w:t>
+            </w:r>
+            <w:r>
+              <w:rPr>
+                <w:rFonts w:ascii="Cascadia Mono" w:hAnsi="Cascadia Mono" w:cs="Cascadia Mono"/>
+                <w:sz w:val="20"/>
+                <w:szCs w:val="20"/>
+              </w:rPr>
+              <w:t>]=True;</w:t>
+            </w:r>
           </w:p>
         </w:tc>
       </w:tr>
@@ -22638,7 +23996,7 @@
         </w:numPr>
       </w:pPr>
       <w:r>
-        <w:t>Получение активных сделок с разрешением на ремонт</w:t>
+        <w:t>Получение активных сделок с разрешением на курение</w:t>
       </w:r>
     </w:p>
     <w:p>
@@ -22664,9 +24022,85 @@
           </w:tcPr>
           <w:p>
             <w:pPr>
+              <w:ind w:firstLine="0"/>
+              <w:rPr>
+                <w:rFonts w:ascii="Cascadia Mono" w:hAnsi="Cascadia Mono" w:cs="Cascadia Mono"/>
+                <w:sz w:val="20"/>
+                <w:szCs w:val="20"/>
+              </w:rPr>
+            </w:pPr>
+            <w:r>
+              <w:rPr>
+                <w:rFonts w:ascii="Cascadia Mono" w:hAnsi="Cascadia Mono" w:cs="Cascadia Mono"/>
+                <w:sz w:val="20"/>
+                <w:szCs w:val="20"/>
+              </w:rPr>
+              <w:t>SELECT *</w:t>
+            </w:r>
+          </w:p>
+          <w:p>
+            <w:pPr>
+              <w:ind w:firstLine="0"/>
+              <w:rPr>
+                <w:rFonts w:ascii="Cascadia Mono" w:hAnsi="Cascadia Mono" w:cs="Cascadia Mono"/>
+                <w:sz w:val="20"/>
+                <w:szCs w:val="20"/>
+              </w:rPr>
+            </w:pPr>
+            <w:r>
+              <w:rPr>
+                <w:rFonts w:ascii="Cascadia Mono" w:hAnsi="Cascadia Mono" w:cs="Cascadia Mono"/>
+                <w:sz w:val="20"/>
+                <w:szCs w:val="20"/>
+              </w:rPr>
+              <w:t>FROM [Активные сделки]</w:t>
+            </w:r>
+          </w:p>
+          <w:p>
+            <w:pPr>
               <w:pStyle w:val="a7"/>
               <w:ind w:left="0" w:firstLine="0"/>
             </w:pPr>
+            <w:r>
+              <w:rPr>
+                <w:rFonts w:ascii="Cascadia Mono" w:hAnsi="Cascadia Mono" w:cs="Cascadia Mono"/>
+                <w:sz w:val="20"/>
+                <w:szCs w:val="20"/>
+              </w:rPr>
+              <w:t>WHERE [Разрешен</w:t>
+            </w:r>
+            <w:r>
+              <w:rPr>
+                <w:rFonts w:ascii="Cascadia Mono" w:hAnsi="Cascadia Mono" w:cs="Cascadia Mono"/>
+                <w:sz w:val="20"/>
+                <w:szCs w:val="20"/>
+              </w:rPr>
+              <w:t>о</w:t>
+            </w:r>
+            <w:r>
+              <w:rPr>
+                <w:rFonts w:ascii="Cascadia Mono" w:hAnsi="Cascadia Mono" w:cs="Cascadia Mono"/>
+                <w:sz w:val="20"/>
+                <w:szCs w:val="20"/>
+              </w:rPr>
+              <w:t xml:space="preserve"> </w:t>
+            </w:r>
+            <w:r>
+              <w:rPr>
+                <w:rFonts w:ascii="Cascadia Mono" w:hAnsi="Cascadia Mono" w:cs="Cascadia Mono"/>
+                <w:sz w:val="20"/>
+                <w:szCs w:val="20"/>
+              </w:rPr>
+              <w:t>курение</w:t>
+            </w:r>
+            <w:r>
+              <w:rPr>
+                <w:rFonts w:ascii="Cascadia Mono" w:hAnsi="Cascadia Mono" w:cs="Cascadia Mono"/>
+                <w:sz w:val="20"/>
+                <w:szCs w:val="20"/>
+              </w:rPr>
+              <w:t>]=True;</w:t>
+            </w:r>
           </w:p>
         </w:tc>
       </w:tr>
@@ -22686,13 +24120,7 @@
         </w:numPr>
       </w:pPr>
       <w:r>
-        <w:t xml:space="preserve">Получение активных сделок с удобным подъёмом (лифт или </w:t>
-      </w:r>
-      <w:r>
-        <w:t>&lt;</w:t>
-      </w:r>
-      <w:r>
-        <w:t>3 этажей)</w:t>
+        <w:t>Получение активных сделок с разрешением на ремонт</w:t>
       </w:r>
     </w:p>
     <w:p>
@@ -22718,9 +24146,85 @@
           </w:tcPr>
           <w:p>
             <w:pPr>
+              <w:ind w:firstLine="0"/>
+              <w:rPr>
+                <w:rFonts w:ascii="Cascadia Mono" w:hAnsi="Cascadia Mono" w:cs="Cascadia Mono"/>
+                <w:sz w:val="20"/>
+                <w:szCs w:val="20"/>
+              </w:rPr>
+            </w:pPr>
+            <w:r>
+              <w:rPr>
+                <w:rFonts w:ascii="Cascadia Mono" w:hAnsi="Cascadia Mono" w:cs="Cascadia Mono"/>
+                <w:sz w:val="20"/>
+                <w:szCs w:val="20"/>
+              </w:rPr>
+              <w:t>SELECT *</w:t>
+            </w:r>
+          </w:p>
+          <w:p>
+            <w:pPr>
+              <w:ind w:firstLine="0"/>
+              <w:rPr>
+                <w:rFonts w:ascii="Cascadia Mono" w:hAnsi="Cascadia Mono" w:cs="Cascadia Mono"/>
+                <w:sz w:val="20"/>
+                <w:szCs w:val="20"/>
+              </w:rPr>
+            </w:pPr>
+            <w:r>
+              <w:rPr>
+                <w:rFonts w:ascii="Cascadia Mono" w:hAnsi="Cascadia Mono" w:cs="Cascadia Mono"/>
+                <w:sz w:val="20"/>
+                <w:szCs w:val="20"/>
+              </w:rPr>
+              <w:t>FROM [Активные сделки]</w:t>
+            </w:r>
+          </w:p>
+          <w:p>
+            <w:pPr>
               <w:pStyle w:val="a7"/>
               <w:ind w:left="0" w:firstLine="0"/>
             </w:pPr>
+            <w:r>
+              <w:rPr>
+                <w:rFonts w:ascii="Cascadia Mono" w:hAnsi="Cascadia Mono" w:cs="Cascadia Mono"/>
+                <w:sz w:val="20"/>
+                <w:szCs w:val="20"/>
+              </w:rPr>
+              <w:t>WHERE [Разрешен</w:t>
+            </w:r>
+            <w:r>
+              <w:rPr>
+                <w:rFonts w:ascii="Cascadia Mono" w:hAnsi="Cascadia Mono" w:cs="Cascadia Mono"/>
+                <w:sz w:val="20"/>
+                <w:szCs w:val="20"/>
+              </w:rPr>
+              <w:t>а</w:t>
+            </w:r>
+            <w:r>
+              <w:rPr>
+                <w:rFonts w:ascii="Cascadia Mono" w:hAnsi="Cascadia Mono" w:cs="Cascadia Mono"/>
+                <w:sz w:val="20"/>
+                <w:szCs w:val="20"/>
+              </w:rPr>
+              <w:t xml:space="preserve"> </w:t>
+            </w:r>
+            <w:r>
+              <w:rPr>
+                <w:rFonts w:ascii="Cascadia Mono" w:hAnsi="Cascadia Mono" w:cs="Cascadia Mono"/>
+                <w:sz w:val="20"/>
+                <w:szCs w:val="20"/>
+              </w:rPr>
+              <w:t>смена интерьера</w:t>
+            </w:r>
+            <w:r>
+              <w:rPr>
+                <w:rFonts w:ascii="Cascadia Mono" w:hAnsi="Cascadia Mono" w:cs="Cascadia Mono"/>
+                <w:sz w:val="20"/>
+                <w:szCs w:val="20"/>
+              </w:rPr>
+              <w:t>]=True;</w:t>
+            </w:r>
           </w:p>
         </w:tc>
       </w:tr>
@@ -22740,19 +24244,13 @@
         </w:numPr>
       </w:pPr>
       <w:r>
-        <w:t>Получение активных сделок, подходящих для студентов (разрешены иногородние</w:t>
-      </w:r>
-      <w:r>
-        <w:t>/</w:t>
-      </w:r>
-      <w:r>
-        <w:t>иностранцы</w:t>
-      </w:r>
-      <w:r>
-        <w:t xml:space="preserve">, </w:t>
-      </w:r>
-      <w:r>
-        <w:t>возраст от 17 или 18, сортировка по цене)</w:t>
+        <w:t xml:space="preserve">Получение активных сделок с удобным подъёмом (лифт или </w:t>
+      </w:r>
+      <w:r>
+        <w:t>&lt;</w:t>
+      </w:r>
+      <w:r>
+        <w:t>3 этажей)</w:t>
       </w:r>
     </w:p>
     <w:p>
@@ -22778,9 +24276,53 @@
           </w:tcPr>
           <w:p>
             <w:pPr>
+              <w:ind w:firstLine="0"/>
+              <w:rPr>
+                <w:rFonts w:ascii="Cascadia Mono" w:hAnsi="Cascadia Mono" w:cs="Cascadia Mono"/>
+                <w:sz w:val="20"/>
+                <w:szCs w:val="20"/>
+              </w:rPr>
+            </w:pPr>
+            <w:r>
+              <w:rPr>
+                <w:rFonts w:ascii="Cascadia Mono" w:hAnsi="Cascadia Mono" w:cs="Cascadia Mono"/>
+                <w:sz w:val="20"/>
+                <w:szCs w:val="20"/>
+              </w:rPr>
+              <w:t>SELECT *</w:t>
+            </w:r>
+          </w:p>
+          <w:p>
+            <w:pPr>
+              <w:ind w:firstLine="0"/>
+              <w:rPr>
+                <w:rFonts w:ascii="Cascadia Mono" w:hAnsi="Cascadia Mono" w:cs="Cascadia Mono"/>
+                <w:sz w:val="20"/>
+                <w:szCs w:val="20"/>
+              </w:rPr>
+            </w:pPr>
+            <w:r>
+              <w:rPr>
+                <w:rFonts w:ascii="Cascadia Mono" w:hAnsi="Cascadia Mono" w:cs="Cascadia Mono"/>
+                <w:sz w:val="20"/>
+                <w:szCs w:val="20"/>
+              </w:rPr>
+              <w:t>FROM [Активные сделки]</w:t>
+            </w:r>
+          </w:p>
+          <w:p>
+            <w:pPr>
               <w:pStyle w:val="a7"/>
               <w:ind w:left="0" w:firstLine="0"/>
             </w:pPr>
+            <w:r>
+              <w:rPr>
+                <w:rFonts w:ascii="Cascadia Mono" w:hAnsi="Cascadia Mono" w:cs="Cascadia Mono"/>
+                <w:sz w:val="20"/>
+                <w:szCs w:val="20"/>
+              </w:rPr>
+              <w:t>WHERE [Этаж] &lt; 3 OR [Наличие лифта]=True;</w:t>
+            </w:r>
           </w:p>
         </w:tc>
       </w:tr>
@@ -22800,13 +24342,19 @@
         </w:numPr>
       </w:pPr>
       <w:r>
-        <w:t>Получение активных сделок, подходящих для пенсионеров (лифт или 1 этаж</w:t>
+        <w:t>Получение активных сделок, подходящих для студентов (разрешены иногородние</w:t>
+      </w:r>
+      <w:r>
+        <w:t>/</w:t>
+      </w:r>
+      <w:r>
+        <w:t>иностранцы</w:t>
       </w:r>
       <w:r>
         <w:t xml:space="preserve">, </w:t>
       </w:r>
       <w:r>
-        <w:t>возраст до 100, сортировка по цене)</w:t>
+        <w:t>возраст от 17 или 18, сортировка по цене)</w:t>
       </w:r>
     </w:p>
     <w:p>
@@ -22832,9 +24380,53 @@
           </w:tcPr>
           <w:p>
             <w:pPr>
+              <w:ind w:firstLine="0"/>
+              <w:rPr>
+                <w:rFonts w:ascii="Cascadia Mono" w:hAnsi="Cascadia Mono" w:cs="Cascadia Mono"/>
+                <w:sz w:val="20"/>
+                <w:szCs w:val="20"/>
+              </w:rPr>
+            </w:pPr>
+            <w:r>
+              <w:rPr>
+                <w:rFonts w:ascii="Cascadia Mono" w:hAnsi="Cascadia Mono" w:cs="Cascadia Mono"/>
+                <w:sz w:val="20"/>
+                <w:szCs w:val="20"/>
+              </w:rPr>
+              <w:t>SELECT *</w:t>
+            </w:r>
+          </w:p>
+          <w:p>
+            <w:pPr>
+              <w:ind w:firstLine="0"/>
+              <w:rPr>
+                <w:rFonts w:ascii="Cascadia Mono" w:hAnsi="Cascadia Mono" w:cs="Cascadia Mono"/>
+                <w:sz w:val="20"/>
+                <w:szCs w:val="20"/>
+              </w:rPr>
+            </w:pPr>
+            <w:r>
+              <w:rPr>
+                <w:rFonts w:ascii="Cascadia Mono" w:hAnsi="Cascadia Mono" w:cs="Cascadia Mono"/>
+                <w:sz w:val="20"/>
+                <w:szCs w:val="20"/>
+              </w:rPr>
+              <w:t>FROM [Активные сделки]</w:t>
+            </w:r>
+          </w:p>
+          <w:p>
+            <w:pPr>
               <w:pStyle w:val="a7"/>
               <w:ind w:left="0" w:firstLine="0"/>
             </w:pPr>
+            <w:r>
+              <w:rPr>
+                <w:rFonts w:ascii="Cascadia Mono" w:hAnsi="Cascadia Mono" w:cs="Cascadia Mono"/>
+                <w:sz w:val="20"/>
+                <w:szCs w:val="20"/>
+              </w:rPr>
+              <w:t>WHERE ([Разрешены иногородние]=True OR [Разрешены иностранцы]=True) AND ([Желаемый минимальный возраст] &gt;= 17);</w:t>
+            </w:r>
           </w:p>
         </w:tc>
       </w:tr>
@@ -22854,7 +24446,19 @@
         </w:numPr>
       </w:pPr>
       <w:r>
-        <w:t xml:space="preserve">Получение активных сделок, подходящих для семей (максимальное кол-во человек от 3, ) </w:t>
+        <w:t>Получение активных сделок, подходящих для пенсионеров (лифт или 1 этаж</w:t>
+      </w:r>
+      <w:r>
+        <w:t xml:space="preserve">, </w:t>
+      </w:r>
+      <w:r>
+        <w:t xml:space="preserve">возраст </w:t>
+      </w:r>
+      <w:r>
+        <w:t xml:space="preserve">от 50 </w:t>
+      </w:r>
+      <w:r>
+        <w:t>до 100, сортировка по цене)</w:t>
       </w:r>
     </w:p>
     <w:p>
@@ -22880,9 +24484,53 @@
           </w:tcPr>
           <w:p>
             <w:pPr>
+              <w:ind w:firstLine="0"/>
+              <w:rPr>
+                <w:rFonts w:ascii="Cascadia Mono" w:hAnsi="Cascadia Mono" w:cs="Cascadia Mono"/>
+                <w:sz w:val="20"/>
+                <w:szCs w:val="20"/>
+              </w:rPr>
+            </w:pPr>
+            <w:r>
+              <w:rPr>
+                <w:rFonts w:ascii="Cascadia Mono" w:hAnsi="Cascadia Mono" w:cs="Cascadia Mono"/>
+                <w:sz w:val="20"/>
+                <w:szCs w:val="20"/>
+              </w:rPr>
+              <w:t>SELECT *</w:t>
+            </w:r>
+          </w:p>
+          <w:p>
+            <w:pPr>
+              <w:ind w:firstLine="0"/>
+              <w:rPr>
+                <w:rFonts w:ascii="Cascadia Mono" w:hAnsi="Cascadia Mono" w:cs="Cascadia Mono"/>
+                <w:sz w:val="20"/>
+                <w:szCs w:val="20"/>
+              </w:rPr>
+            </w:pPr>
+            <w:r>
+              <w:rPr>
+                <w:rFonts w:ascii="Cascadia Mono" w:hAnsi="Cascadia Mono" w:cs="Cascadia Mono"/>
+                <w:sz w:val="20"/>
+                <w:szCs w:val="20"/>
+              </w:rPr>
+              <w:t>FROM [Активные сделки]</w:t>
+            </w:r>
+          </w:p>
+          <w:p>
+            <w:pPr>
               <w:pStyle w:val="a7"/>
               <w:ind w:left="0" w:firstLine="0"/>
             </w:pPr>
+            <w:r>
+              <w:rPr>
+                <w:rFonts w:ascii="Cascadia Mono" w:hAnsi="Cascadia Mono" w:cs="Cascadia Mono"/>
+                <w:sz w:val="20"/>
+                <w:szCs w:val="20"/>
+              </w:rPr>
+              <w:t>WHERE ([Наличие лифта]=True OR [Этаж]=1) AND ([Желаемый минимальный возраст] &gt;= 50 AND [Желаемый максимальный возраст] &lt;= 100);</w:t>
+            </w:r>
           </w:p>
         </w:tc>
       </w:tr>
@@ -22902,25 +24550,7 @@
         </w:numPr>
       </w:pPr>
       <w:r>
-        <w:t>Получение активных сделок, подходящих для журналистов или гостей (разрешены иногородние</w:t>
-      </w:r>
-      <w:r>
-        <w:t>/</w:t>
-      </w:r>
-      <w:r>
-        <w:t xml:space="preserve">иностранцы, лифт или </w:t>
-      </w:r>
-      <w:r>
-        <w:t>&lt;</w:t>
-      </w:r>
-      <w:r>
-        <w:t>3 этажей, наличие мусоропровода,</w:t>
-      </w:r>
-      <w:r>
-        <w:t xml:space="preserve"> наличие отопления,</w:t>
-      </w:r>
-      <w:r>
-        <w:t xml:space="preserve"> сортировка по удалённости от центра)</w:t>
+        <w:t xml:space="preserve">Получение активных сделок, подходящих для семей (максимальное кол-во человек от 3, ) </w:t>
       </w:r>
     </w:p>
     <w:p>
@@ -22946,9 +24576,53 @@
           </w:tcPr>
           <w:p>
             <w:pPr>
+              <w:ind w:firstLine="0"/>
+              <w:rPr>
+                <w:rFonts w:ascii="Cascadia Mono" w:hAnsi="Cascadia Mono" w:cs="Cascadia Mono"/>
+                <w:sz w:val="20"/>
+                <w:szCs w:val="20"/>
+              </w:rPr>
+            </w:pPr>
+            <w:r>
+              <w:rPr>
+                <w:rFonts w:ascii="Cascadia Mono" w:hAnsi="Cascadia Mono" w:cs="Cascadia Mono"/>
+                <w:sz w:val="20"/>
+                <w:szCs w:val="20"/>
+              </w:rPr>
+              <w:t>SELECT *</w:t>
+            </w:r>
+          </w:p>
+          <w:p>
+            <w:pPr>
+              <w:ind w:firstLine="0"/>
+              <w:rPr>
+                <w:rFonts w:ascii="Cascadia Mono" w:hAnsi="Cascadia Mono" w:cs="Cascadia Mono"/>
+                <w:sz w:val="20"/>
+                <w:szCs w:val="20"/>
+              </w:rPr>
+            </w:pPr>
+            <w:r>
+              <w:rPr>
+                <w:rFonts w:ascii="Cascadia Mono" w:hAnsi="Cascadia Mono" w:cs="Cascadia Mono"/>
+                <w:sz w:val="20"/>
+                <w:szCs w:val="20"/>
+              </w:rPr>
+              <w:t>FROM [Активные сделки]</w:t>
+            </w:r>
+          </w:p>
+          <w:p>
+            <w:pPr>
               <w:pStyle w:val="a7"/>
               <w:ind w:left="0" w:firstLine="0"/>
             </w:pPr>
+            <w:r>
+              <w:rPr>
+                <w:rFonts w:ascii="Cascadia Mono" w:hAnsi="Cascadia Mono" w:cs="Cascadia Mono"/>
+                <w:sz w:val="20"/>
+                <w:szCs w:val="20"/>
+              </w:rPr>
+              <w:t>WHERE [Максимальное число человек] &gt;= 3;</w:t>
+            </w:r>
           </w:p>
         </w:tc>
       </w:tr>
@@ -22968,7 +24642,26 @@
         </w:numPr>
       </w:pPr>
       <w:r>
-        <w:t>Получение активных сделок без задолженностей и ограничений</w:t>
+        <w:lastRenderedPageBreak/>
+        <w:t>Получение активных сделок, подходящих для журналистов или гостей (разрешены иногородние</w:t>
+      </w:r>
+      <w:r>
+        <w:t>/</w:t>
+      </w:r>
+      <w:r>
+        <w:t xml:space="preserve">иностранцы, лифт или </w:t>
+      </w:r>
+      <w:r>
+        <w:t>&lt;</w:t>
+      </w:r>
+      <w:r>
+        <w:t>3 этажей, наличие мусоропровода,</w:t>
+      </w:r>
+      <w:r>
+        <w:t xml:space="preserve"> наличие отопления,</w:t>
+      </w:r>
+      <w:r>
+        <w:t xml:space="preserve"> сортировка по удалённости от центра)</w:t>
       </w:r>
     </w:p>
     <w:p>
@@ -22994,9 +24687,71 @@
           </w:tcPr>
           <w:p>
             <w:pPr>
+              <w:ind w:firstLine="0"/>
+              <w:rPr>
+                <w:rFonts w:ascii="Cascadia Mono" w:hAnsi="Cascadia Mono" w:cs="Cascadia Mono"/>
+                <w:sz w:val="20"/>
+                <w:szCs w:val="20"/>
+              </w:rPr>
+            </w:pPr>
+            <w:r>
+              <w:rPr>
+                <w:rFonts w:ascii="Cascadia Mono" w:hAnsi="Cascadia Mono" w:cs="Cascadia Mono"/>
+                <w:sz w:val="20"/>
+                <w:szCs w:val="20"/>
+              </w:rPr>
+              <w:t>SELECT *</w:t>
+            </w:r>
+          </w:p>
+          <w:p>
+            <w:pPr>
+              <w:ind w:firstLine="0"/>
+              <w:rPr>
+                <w:rFonts w:ascii="Cascadia Mono" w:hAnsi="Cascadia Mono" w:cs="Cascadia Mono"/>
+                <w:sz w:val="20"/>
+                <w:szCs w:val="20"/>
+              </w:rPr>
+            </w:pPr>
+            <w:r>
+              <w:rPr>
+                <w:rFonts w:ascii="Cascadia Mono" w:hAnsi="Cascadia Mono" w:cs="Cascadia Mono"/>
+                <w:sz w:val="20"/>
+                <w:szCs w:val="20"/>
+              </w:rPr>
+              <w:t>FROM [Активные сделки]</w:t>
+            </w:r>
+          </w:p>
+          <w:p>
+            <w:pPr>
+              <w:ind w:firstLine="0"/>
+              <w:rPr>
+                <w:rFonts w:ascii="Cascadia Mono" w:hAnsi="Cascadia Mono" w:cs="Cascadia Mono"/>
+                <w:sz w:val="20"/>
+                <w:szCs w:val="20"/>
+              </w:rPr>
+            </w:pPr>
+            <w:r>
+              <w:rPr>
+                <w:rFonts w:ascii="Cascadia Mono" w:hAnsi="Cascadia Mono" w:cs="Cascadia Mono"/>
+                <w:sz w:val="20"/>
+                <w:szCs w:val="20"/>
+              </w:rPr>
+              <w:t>WHERE ([Разрешены иногородние] = True OR [Разрешены иностранцы] = True) AND [Наличие лифта] = True AND [Наличие мусоропровода] = True AND [Тип отопления] &lt;&gt; "Нет"</w:t>
+            </w:r>
+          </w:p>
+          <w:p>
+            <w:pPr>
               <w:pStyle w:val="a7"/>
               <w:ind w:left="0" w:firstLine="0"/>
             </w:pPr>
+            <w:r>
+              <w:rPr>
+                <w:rFonts w:ascii="Cascadia Mono" w:hAnsi="Cascadia Mono" w:cs="Cascadia Mono"/>
+                <w:sz w:val="20"/>
+                <w:szCs w:val="20"/>
+              </w:rPr>
+              <w:t>ORDER BY [Удалённость от центра];</w:t>
+            </w:r>
           </w:p>
         </w:tc>
       </w:tr>
@@ -23016,7 +24771,7 @@
         </w:numPr>
       </w:pPr>
       <w:r>
-        <w:t>Получение активных сделок в старых домах</w:t>
+        <w:t>Получение активных сделок без задолженностей и ограничений</w:t>
       </w:r>
     </w:p>
     <w:p>
@@ -23042,9 +24797,53 @@
           </w:tcPr>
           <w:p>
             <w:pPr>
+              <w:ind w:firstLine="0"/>
+              <w:rPr>
+                <w:rFonts w:ascii="Cascadia Mono" w:hAnsi="Cascadia Mono" w:cs="Cascadia Mono"/>
+                <w:sz w:val="20"/>
+                <w:szCs w:val="20"/>
+              </w:rPr>
+            </w:pPr>
+            <w:r>
+              <w:rPr>
+                <w:rFonts w:ascii="Cascadia Mono" w:hAnsi="Cascadia Mono" w:cs="Cascadia Mono"/>
+                <w:sz w:val="20"/>
+                <w:szCs w:val="20"/>
+              </w:rPr>
+              <w:t>SELECT *</w:t>
+            </w:r>
+          </w:p>
+          <w:p>
+            <w:pPr>
+              <w:ind w:firstLine="0"/>
+              <w:rPr>
+                <w:rFonts w:ascii="Cascadia Mono" w:hAnsi="Cascadia Mono" w:cs="Cascadia Mono"/>
+                <w:sz w:val="20"/>
+                <w:szCs w:val="20"/>
+              </w:rPr>
+            </w:pPr>
+            <w:r>
+              <w:rPr>
+                <w:rFonts w:ascii="Cascadia Mono" w:hAnsi="Cascadia Mono" w:cs="Cascadia Mono"/>
+                <w:sz w:val="20"/>
+                <w:szCs w:val="20"/>
+              </w:rPr>
+              <w:t>FROM [Активные сделки]</w:t>
+            </w:r>
+          </w:p>
+          <w:p>
+            <w:pPr>
               <w:pStyle w:val="a7"/>
               <w:ind w:left="0" w:firstLine="0"/>
             </w:pPr>
+            <w:r>
+              <w:rPr>
+                <w:rFonts w:ascii="Cascadia Mono" w:hAnsi="Cascadia Mono" w:cs="Cascadia Mono"/>
+                <w:sz w:val="20"/>
+                <w:szCs w:val="20"/>
+              </w:rPr>
+              <w:t>WHERE [Тип задолженности] = "Нет" AND [Тип ограничения] = "Нет";</w:t>
+            </w:r>
           </w:p>
         </w:tc>
       </w:tr>
@@ -23064,7 +24863,10 @@
         </w:numPr>
       </w:pPr>
       <w:r>
-        <w:t>Получение активных сделок в новостройках</w:t>
+        <w:t>Получение активных сделок в старых домах</w:t>
+      </w:r>
+      <w:r>
+        <w:t xml:space="preserve"> (до 2000 года)</w:t>
       </w:r>
     </w:p>
     <w:p>
@@ -23090,9 +24892,53 @@
           </w:tcPr>
           <w:p>
             <w:pPr>
+              <w:ind w:firstLine="0"/>
+              <w:rPr>
+                <w:rFonts w:ascii="Cascadia Mono" w:hAnsi="Cascadia Mono" w:cs="Cascadia Mono"/>
+                <w:sz w:val="20"/>
+                <w:szCs w:val="20"/>
+              </w:rPr>
+            </w:pPr>
+            <w:r>
+              <w:rPr>
+                <w:rFonts w:ascii="Cascadia Mono" w:hAnsi="Cascadia Mono" w:cs="Cascadia Mono"/>
+                <w:sz w:val="20"/>
+                <w:szCs w:val="20"/>
+              </w:rPr>
+              <w:t>SELECT *</w:t>
+            </w:r>
+          </w:p>
+          <w:p>
+            <w:pPr>
+              <w:ind w:firstLine="0"/>
+              <w:rPr>
+                <w:rFonts w:ascii="Cascadia Mono" w:hAnsi="Cascadia Mono" w:cs="Cascadia Mono"/>
+                <w:sz w:val="20"/>
+                <w:szCs w:val="20"/>
+              </w:rPr>
+            </w:pPr>
+            <w:r>
+              <w:rPr>
+                <w:rFonts w:ascii="Cascadia Mono" w:hAnsi="Cascadia Mono" w:cs="Cascadia Mono"/>
+                <w:sz w:val="20"/>
+                <w:szCs w:val="20"/>
+              </w:rPr>
+              <w:t>FROM [Активные сделки]</w:t>
+            </w:r>
+          </w:p>
+          <w:p>
+            <w:pPr>
               <w:pStyle w:val="a7"/>
               <w:ind w:left="0" w:firstLine="0"/>
             </w:pPr>
+            <w:r>
+              <w:rPr>
+                <w:rFonts w:ascii="Cascadia Mono" w:hAnsi="Cascadia Mono" w:cs="Cascadia Mono"/>
+                <w:sz w:val="20"/>
+                <w:szCs w:val="20"/>
+              </w:rPr>
+              <w:t>WHERE Year([Дата постройки]) &lt; 2000;</w:t>
+            </w:r>
           </w:p>
         </w:tc>
       </w:tr>
@@ -23112,16 +24958,7 @@
         </w:numPr>
       </w:pPr>
       <w:r>
-        <w:t xml:space="preserve">Получение активных сделок в новостройках </w:t>
-      </w:r>
-      <w:r>
-        <w:t xml:space="preserve">не </w:t>
-      </w:r>
-      <w:r>
-        <w:t xml:space="preserve">из </w:t>
-      </w:r>
-      <w:r>
-        <w:t>газоблока</w:t>
+        <w:t>Получение активных сделок в новостройках</w:t>
       </w:r>
     </w:p>
     <w:p>
@@ -23147,17 +24984,62 @@
           </w:tcPr>
           <w:p>
             <w:pPr>
+              <w:ind w:firstLine="0"/>
+              <w:rPr>
+                <w:rFonts w:ascii="Cascadia Mono" w:hAnsi="Cascadia Mono" w:cs="Cascadia Mono"/>
+                <w:sz w:val="20"/>
+                <w:szCs w:val="20"/>
+              </w:rPr>
+            </w:pPr>
+            <w:r>
+              <w:rPr>
+                <w:rFonts w:ascii="Cascadia Mono" w:hAnsi="Cascadia Mono" w:cs="Cascadia Mono"/>
+                <w:sz w:val="20"/>
+                <w:szCs w:val="20"/>
+              </w:rPr>
+              <w:t>SELECT *</w:t>
+            </w:r>
+          </w:p>
+          <w:p>
+            <w:pPr>
+              <w:ind w:firstLine="0"/>
+              <w:rPr>
+                <w:rFonts w:ascii="Cascadia Mono" w:hAnsi="Cascadia Mono" w:cs="Cascadia Mono"/>
+                <w:sz w:val="20"/>
+                <w:szCs w:val="20"/>
+              </w:rPr>
+            </w:pPr>
+            <w:r>
+              <w:rPr>
+                <w:rFonts w:ascii="Cascadia Mono" w:hAnsi="Cascadia Mono" w:cs="Cascadia Mono"/>
+                <w:sz w:val="20"/>
+                <w:szCs w:val="20"/>
+              </w:rPr>
+              <w:t>FROM [Активные сделки]</w:t>
+            </w:r>
+          </w:p>
+          <w:p>
+            <w:pPr>
               <w:pStyle w:val="a7"/>
               <w:ind w:left="0" w:firstLine="0"/>
             </w:pPr>
+            <w:r>
+              <w:rPr>
+                <w:rFonts w:ascii="Cascadia Mono" w:hAnsi="Cascadia Mono" w:cs="Cascadia Mono"/>
+                <w:sz w:val="20"/>
+                <w:szCs w:val="20"/>
+              </w:rPr>
+              <w:t>WHERE Year([Дата постройки]) &gt;= 2000;</w:t>
+            </w:r>
           </w:p>
         </w:tc>
       </w:tr>
     </w:tbl>
     <w:p>
       <w:pPr>
-        <w:pStyle w:val="a7"/>
-        <w:ind w:firstLine="0"/>
+        <w:rPr>
+          <w:lang w:val="en-US"/>
+        </w:rPr>
       </w:pPr>
     </w:p>
     <w:p>
@@ -23195,9 +25077,53 @@
           </w:tcPr>
           <w:p>
             <w:pPr>
+              <w:ind w:firstLine="0"/>
+              <w:rPr>
+                <w:rFonts w:ascii="Cascadia Mono" w:hAnsi="Cascadia Mono" w:cs="Cascadia Mono"/>
+                <w:sz w:val="20"/>
+                <w:szCs w:val="20"/>
+              </w:rPr>
+            </w:pPr>
+            <w:r>
+              <w:rPr>
+                <w:rFonts w:ascii="Cascadia Mono" w:hAnsi="Cascadia Mono" w:cs="Cascadia Mono"/>
+                <w:sz w:val="20"/>
+                <w:szCs w:val="20"/>
+              </w:rPr>
+              <w:t>SELECT *</w:t>
+            </w:r>
+          </w:p>
+          <w:p>
+            <w:pPr>
+              <w:ind w:firstLine="0"/>
+              <w:rPr>
+                <w:rFonts w:ascii="Cascadia Mono" w:hAnsi="Cascadia Mono" w:cs="Cascadia Mono"/>
+                <w:sz w:val="20"/>
+                <w:szCs w:val="20"/>
+              </w:rPr>
+            </w:pPr>
+            <w:r>
+              <w:rPr>
+                <w:rFonts w:ascii="Cascadia Mono" w:hAnsi="Cascadia Mono" w:cs="Cascadia Mono"/>
+                <w:sz w:val="20"/>
+                <w:szCs w:val="20"/>
+              </w:rPr>
+              <w:t>FROM [Активные сделки]</w:t>
+            </w:r>
+          </w:p>
+          <w:p>
+            <w:pPr>
               <w:pStyle w:val="a7"/>
               <w:ind w:left="0" w:firstLine="0"/>
             </w:pPr>
+            <w:r>
+              <w:rPr>
+                <w:rFonts w:ascii="Cascadia Mono" w:hAnsi="Cascadia Mono" w:cs="Cascadia Mono"/>
+                <w:sz w:val="20"/>
+                <w:szCs w:val="20"/>
+              </w:rPr>
+              <w:t>WHERE [Тип домоуправления] = "Кооператив";</w:t>
+            </w:r>
           </w:p>
         </w:tc>
       </w:tr>
@@ -31414,7 +33340,7 @@
   <w:abstractNum w:abstractNumId="8" w15:restartNumberingAfterBreak="0">
     <w:nsid w:val="74727B74"/>
     <w:multiLevelType w:val="hybridMultilevel"/>
-    <w:tmpl w:val="00062A6C"/>
+    <w:tmpl w:val="29EA74A6"/>
     <w:lvl w:ilvl="0" w:tplc="04190001">
       <w:start w:val="1"/>
       <w:numFmt w:val="bullet"/>

</xml_diff>